<commit_message>
Capitulo 3 updated with final version
</commit_message>
<xml_diff>
--- a/docs/Capítulo 3 - Hipótesis de partida.docx
+++ b/docs/Capítulo 3 - Hipótesis de partida.docx
@@ -190,7 +190,6 @@
         </w:rPr>
         <w:t xml:space="preserve">En el presente capítulo se describen las tecnologías, herramientas y metodologías empleadas en el desarrollo de </w:t>
       </w:r>
-      <w:proofErr w:type="spellStart"/>
       <w:r>
         <w:rPr>
           <w:rFonts w:ascii="Times New Roman" w:eastAsia="Times New Roman" w:hAnsi="Times New Roman" w:cs="Times New Roman"/>
@@ -199,7 +198,6 @@
         </w:rPr>
         <w:t>CarePet</w:t>
       </w:r>
-      <w:proofErr w:type="spellEnd"/>
       <w:r>
         <w:rPr>
           <w:rFonts w:ascii="Times New Roman" w:eastAsia="Times New Roman" w:hAnsi="Times New Roman" w:cs="Times New Roman"/>
@@ -316,7 +314,6 @@
         </w:rPr>
         <w:t xml:space="preserve">Antes de describir las tecnologías concretas, es necesario situar el contexto arquitectónico en el que se integran. </w:t>
       </w:r>
-      <w:proofErr w:type="spellStart"/>
       <w:r>
         <w:rPr>
           <w:rFonts w:ascii="Times New Roman" w:eastAsia="Times New Roman" w:hAnsi="Times New Roman" w:cs="Times New Roman"/>
@@ -325,7 +322,6 @@
         </w:rPr>
         <w:t>CarePet</w:t>
       </w:r>
-      <w:proofErr w:type="spellEnd"/>
       <w:r>
         <w:rPr>
           <w:rFonts w:ascii="Times New Roman" w:eastAsia="Times New Roman" w:hAnsi="Times New Roman" w:cs="Times New Roman"/>
@@ -494,7 +490,6 @@
         </w:rPr>
         <w:t xml:space="preserve">En </w:t>
       </w:r>
-      <w:proofErr w:type="spellStart"/>
       <w:r>
         <w:rPr>
           <w:rFonts w:ascii="Times New Roman" w:eastAsia="Times New Roman" w:hAnsi="Times New Roman" w:cs="Times New Roman"/>
@@ -503,7 +498,6 @@
         </w:rPr>
         <w:t>CarePet</w:t>
       </w:r>
-      <w:proofErr w:type="spellEnd"/>
       <w:r>
         <w:rPr>
           <w:rFonts w:ascii="Times New Roman" w:eastAsia="Times New Roman" w:hAnsi="Times New Roman" w:cs="Times New Roman"/>
@@ -757,7 +751,7 @@
           <w:sz w:val="24"/>
           <w:szCs w:val="24"/>
         </w:rPr>
-        <w:t xml:space="preserve">Adicionalmente, para la sincronización en tiempo real entre los distintos cuidadores del hogar, se ha previsto la incorporación de </w:t>
+        <w:t xml:space="preserve">Adicionalmente, la sincronización en tiempo real entre los distintos cuidadores del hogar mediante </w:t>
       </w:r>
       <w:proofErr w:type="spellStart"/>
       <w:r>
@@ -775,25 +769,7 @@
           <w:sz w:val="24"/>
           <w:szCs w:val="24"/>
         </w:rPr>
-        <w:t xml:space="preserve">, tecnología que se describe en el apartado 3.2.6 y que permitirá que las acciones confirmadas por un usuario sean visibles de forma inmediata para el resto de </w:t>
-      </w:r>
-      <w:proofErr w:type="gramStart"/>
-      <w:r>
-        <w:rPr>
-          <w:rFonts w:ascii="Times New Roman" w:eastAsia="Times New Roman" w:hAnsi="Times New Roman" w:cs="Times New Roman"/>
-          <w:sz w:val="24"/>
-          <w:szCs w:val="24"/>
-        </w:rPr>
-        <w:t>miembros</w:t>
-      </w:r>
-      <w:proofErr w:type="gramEnd"/>
-      <w:r>
-        <w:rPr>
-          <w:rFonts w:ascii="Times New Roman" w:eastAsia="Times New Roman" w:hAnsi="Times New Roman" w:cs="Times New Roman"/>
-          <w:sz w:val="24"/>
-          <w:szCs w:val="24"/>
-        </w:rPr>
-        <w:t xml:space="preserve"> sin necesidad de recargar la página.</w:t>
+        <w:t xml:space="preserve"> está prevista como mejora futura del proyecto. Su descripción técnica se incluye en el apartado 3.2.6, dado que forma parte de las hipótesis de trabajo sobre las que se asienta la arquitectura, aunque su implementación no ha podido completarse en el marco temporal del presente trabajo.</w:t>
       </w:r>
     </w:p>
     <w:p>
@@ -904,7 +880,6 @@
         <w:lastRenderedPageBreak/>
         <w:t xml:space="preserve">El backend de </w:t>
       </w:r>
-      <w:proofErr w:type="spellStart"/>
       <w:r>
         <w:rPr>
           <w:rFonts w:ascii="Times New Roman" w:eastAsia="Times New Roman" w:hAnsi="Times New Roman" w:cs="Times New Roman"/>
@@ -913,7 +888,6 @@
         </w:rPr>
         <w:t>CarePet</w:t>
       </w:r>
-      <w:proofErr w:type="spellEnd"/>
       <w:r>
         <w:rPr>
           <w:rFonts w:ascii="Times New Roman" w:eastAsia="Times New Roman" w:hAnsi="Times New Roman" w:cs="Times New Roman"/>
@@ -922,16 +896,14 @@
         </w:rPr>
         <w:t xml:space="preserve"> es el núcleo del sistema: gestiona la lógica de negocio, controla el acceso a los datos y garantiza la seguridad de la aplicación. A </w:t>
       </w:r>
-      <w:proofErr w:type="gramStart"/>
-      <w:r>
-        <w:rPr>
-          <w:rFonts w:ascii="Times New Roman" w:eastAsia="Times New Roman" w:hAnsi="Times New Roman" w:cs="Times New Roman"/>
-          <w:sz w:val="24"/>
-          <w:szCs w:val="24"/>
-        </w:rPr>
-        <w:t>continuación</w:t>
-      </w:r>
-      <w:proofErr w:type="gramEnd"/>
+      <w:r>
+        <w:rPr>
+          <w:rFonts w:ascii="Times New Roman" w:eastAsia="Times New Roman" w:hAnsi="Times New Roman" w:cs="Times New Roman"/>
+          <w:sz w:val="24"/>
+          <w:szCs w:val="24"/>
+        </w:rPr>
+        <w:t>continuación,</w:t>
+      </w:r>
       <w:r>
         <w:rPr>
           <w:rFonts w:ascii="Times New Roman" w:eastAsia="Times New Roman" w:hAnsi="Times New Roman" w:cs="Times New Roman"/>
@@ -1169,7 +1141,6 @@
         </w:rPr>
         <w:t xml:space="preserve">En el contexto de </w:t>
       </w:r>
-      <w:proofErr w:type="spellStart"/>
       <w:r>
         <w:rPr>
           <w:rFonts w:ascii="Times New Roman" w:eastAsia="Times New Roman" w:hAnsi="Times New Roman" w:cs="Times New Roman"/>
@@ -1178,7 +1149,6 @@
         </w:rPr>
         <w:t>CarePet</w:t>
       </w:r>
-      <w:proofErr w:type="spellEnd"/>
       <w:r>
         <w:rPr>
           <w:rFonts w:ascii="Times New Roman" w:eastAsia="Times New Roman" w:hAnsi="Times New Roman" w:cs="Times New Roman"/>
@@ -1542,7 +1512,6 @@
         </w:rPr>
         <w:t xml:space="preserve">Dentro de </w:t>
       </w:r>
-      <w:proofErr w:type="spellStart"/>
       <w:r>
         <w:rPr>
           <w:rFonts w:ascii="Times New Roman" w:eastAsia="Times New Roman" w:hAnsi="Times New Roman" w:cs="Times New Roman"/>
@@ -1551,7 +1520,6 @@
         </w:rPr>
         <w:t>CarePet</w:t>
       </w:r>
-      <w:proofErr w:type="spellEnd"/>
       <w:r>
         <w:rPr>
           <w:rFonts w:ascii="Times New Roman" w:eastAsia="Times New Roman" w:hAnsi="Times New Roman" w:cs="Times New Roman"/>
@@ -1834,23 +1802,7 @@
           <w:sz w:val="28"/>
           <w:szCs w:val="28"/>
         </w:rPr>
-        <w:t>3.2.</w:t>
-      </w:r>
-      <w:r>
-        <w:rPr>
-          <w:b/>
-          <w:sz w:val="28"/>
-          <w:szCs w:val="28"/>
-        </w:rPr>
-        <w:t>3</w:t>
-      </w:r>
-      <w:r>
-        <w:rPr>
-          <w:b/>
-          <w:sz w:val="28"/>
-          <w:szCs w:val="28"/>
-        </w:rPr>
-        <w:t xml:space="preserve">.- </w:t>
+        <w:t xml:space="preserve">3.2.3.- </w:t>
       </w:r>
       <w:proofErr w:type="spellStart"/>
       <w:r>
@@ -2142,7 +2094,6 @@
         </w:rPr>
         <w:t xml:space="preserve">En </w:t>
       </w:r>
-      <w:proofErr w:type="spellStart"/>
       <w:r>
         <w:rPr>
           <w:rFonts w:ascii="Times New Roman" w:eastAsia="Times New Roman" w:hAnsi="Times New Roman" w:cs="Times New Roman"/>
@@ -2151,23 +2102,22 @@
         </w:rPr>
         <w:t>CarePet</w:t>
       </w:r>
-      <w:proofErr w:type="spellEnd"/>
-      <w:r>
-        <w:rPr>
-          <w:rFonts w:ascii="Times New Roman" w:eastAsia="Times New Roman" w:hAnsi="Times New Roman" w:cs="Times New Roman"/>
-          <w:sz w:val="24"/>
-          <w:szCs w:val="24"/>
-        </w:rPr>
-        <w:t>, Hibern</w:t>
-      </w:r>
-      <w:proofErr w:type="spellStart"/>
-      <w:r>
-        <w:rPr>
-          <w:rFonts w:ascii="Times New Roman" w:eastAsia="Times New Roman" w:hAnsi="Times New Roman" w:cs="Times New Roman"/>
-          <w:sz w:val="24"/>
-          <w:szCs w:val="24"/>
-        </w:rPr>
-        <w:t>ate</w:t>
+      <w:r>
+        <w:rPr>
+          <w:rFonts w:ascii="Times New Roman" w:eastAsia="Times New Roman" w:hAnsi="Times New Roman" w:cs="Times New Roman"/>
+          <w:sz w:val="24"/>
+          <w:szCs w:val="24"/>
+        </w:rPr>
+        <w:t xml:space="preserve">, </w:t>
+      </w:r>
+      <w:proofErr w:type="spellStart"/>
+      <w:r>
+        <w:rPr>
+          <w:rFonts w:ascii="Times New Roman" w:eastAsia="Times New Roman" w:hAnsi="Times New Roman" w:cs="Times New Roman"/>
+          <w:sz w:val="24"/>
+          <w:szCs w:val="24"/>
+        </w:rPr>
+        <w:t>Hibernate</w:t>
       </w:r>
       <w:proofErr w:type="spellEnd"/>
       <w:r>
@@ -2235,31 +2185,7 @@
           <w:sz w:val="28"/>
           <w:szCs w:val="28"/>
         </w:rPr>
-        <w:t>3.2.</w:t>
-      </w:r>
-      <w:r>
-        <w:rPr>
-          <w:b/>
-          <w:sz w:val="28"/>
-          <w:szCs w:val="28"/>
-        </w:rPr>
-        <w:t>4</w:t>
-      </w:r>
-      <w:r>
-        <w:rPr>
-          <w:b/>
-          <w:sz w:val="28"/>
-          <w:szCs w:val="28"/>
-        </w:rPr>
-        <w:t xml:space="preserve">.- </w:t>
-      </w:r>
-      <w:r>
-        <w:rPr>
-          <w:b/>
-          <w:sz w:val="28"/>
-          <w:szCs w:val="28"/>
-        </w:rPr>
-        <w:t>MySQL 8.0</w:t>
+        <w:t>3.2.4.- MySQL 8.0</w:t>
       </w:r>
     </w:p>
     <w:p>
@@ -2399,7 +2325,6 @@
         </w:rPr>
         <w:t xml:space="preserve">, H2 y MongoDB. Se descartó PostgreSQL por ser técnicamente más avanzado de lo necesario para este proyecto, aunque no inferior: MySQL resulta suficiente para el modelo de datos de </w:t>
       </w:r>
-      <w:proofErr w:type="spellStart"/>
       <w:r>
         <w:rPr>
           <w:rFonts w:ascii="Times New Roman" w:eastAsia="Times New Roman" w:hAnsi="Times New Roman" w:cs="Times New Roman"/>
@@ -2408,7 +2333,6 @@
         </w:rPr>
         <w:t>CarePet</w:t>
       </w:r>
-      <w:proofErr w:type="spellEnd"/>
       <w:r>
         <w:rPr>
           <w:rFonts w:ascii="Times New Roman" w:eastAsia="Times New Roman" w:hAnsi="Times New Roman" w:cs="Times New Roman"/>
@@ -2433,7 +2357,15 @@
           <w:sz w:val="24"/>
           <w:szCs w:val="24"/>
         </w:rPr>
-        <w:t xml:space="preserve"> pero no para un entorno de producción.</w:t>
+        <w:t xml:space="preserve"> </w:t>
+      </w:r>
+      <w:r>
+        <w:rPr>
+          <w:rFonts w:ascii="Times New Roman" w:eastAsia="Times New Roman" w:hAnsi="Times New Roman" w:cs="Times New Roman"/>
+          <w:sz w:val="24"/>
+          <w:szCs w:val="24"/>
+        </w:rPr>
+        <w:t>pero no para un entorno de producción.</w:t>
       </w:r>
     </w:p>
     <w:p>
@@ -2477,7 +2409,6 @@
         </w:rPr>
         <w:t xml:space="preserve">El modelo de datos de </w:t>
       </w:r>
-      <w:proofErr w:type="spellStart"/>
       <w:r>
         <w:rPr>
           <w:rFonts w:ascii="Times New Roman" w:eastAsia="Times New Roman" w:hAnsi="Times New Roman" w:cs="Times New Roman"/>
@@ -2486,7 +2417,6 @@
         </w:rPr>
         <w:t>CarePet</w:t>
       </w:r>
-      <w:proofErr w:type="spellEnd"/>
       <w:r>
         <w:rPr>
           <w:rFonts w:ascii="Times New Roman" w:eastAsia="Times New Roman" w:hAnsi="Times New Roman" w:cs="Times New Roman"/>
@@ -2579,31 +2509,7 @@
           <w:sz w:val="28"/>
           <w:szCs w:val="28"/>
         </w:rPr>
-        <w:t>3.2.</w:t>
-      </w:r>
-      <w:r>
-        <w:rPr>
-          <w:b/>
-          <w:sz w:val="28"/>
-          <w:szCs w:val="28"/>
-        </w:rPr>
-        <w:t>5</w:t>
-      </w:r>
-      <w:r>
-        <w:rPr>
-          <w:b/>
-          <w:sz w:val="28"/>
-          <w:szCs w:val="28"/>
-        </w:rPr>
-        <w:t xml:space="preserve">.- </w:t>
-      </w:r>
-      <w:r>
-        <w:rPr>
-          <w:b/>
-          <w:sz w:val="28"/>
-          <w:szCs w:val="28"/>
-        </w:rPr>
-        <w:t xml:space="preserve">Spring Security, JWT y </w:t>
+        <w:t xml:space="preserve">3.2.5.- Spring Security, JWT y </w:t>
       </w:r>
       <w:proofErr w:type="spellStart"/>
       <w:r>
@@ -2657,7 +2563,6 @@
         </w:rPr>
         <w:t xml:space="preserve">La seguridad de </w:t>
       </w:r>
-      <w:proofErr w:type="spellStart"/>
       <w:r>
         <w:rPr>
           <w:rFonts w:ascii="Times New Roman" w:eastAsia="Times New Roman" w:hAnsi="Times New Roman" w:cs="Times New Roman"/>
@@ -2666,7 +2571,6 @@
         </w:rPr>
         <w:t>CarePet</w:t>
       </w:r>
-      <w:proofErr w:type="spellEnd"/>
       <w:r>
         <w:rPr>
           <w:rFonts w:ascii="Times New Roman" w:eastAsia="Times New Roman" w:hAnsi="Times New Roman" w:cs="Times New Roman"/>
@@ -2753,7 +2657,6 @@
         </w:rPr>
         <w:t xml:space="preserve">Spring Security es el módulo estándar del ecosistema Spring para la gestión de la seguridad en aplicaciones Java. Proporciona un sistema de filtros HTTP que intercepta todas las peticiones entrantes y verifica si el usuario está autenticado y si dispone de los permisos necesarios para acceder al recurso solicitado. En </w:t>
       </w:r>
-      <w:proofErr w:type="spellStart"/>
       <w:r>
         <w:rPr>
           <w:rFonts w:ascii="Times New Roman" w:eastAsia="Times New Roman" w:hAnsi="Times New Roman" w:cs="Times New Roman"/>
@@ -2762,7 +2665,6 @@
         </w:rPr>
         <w:t>CarePet</w:t>
       </w:r>
-      <w:proofErr w:type="spellEnd"/>
       <w:r>
         <w:rPr>
           <w:rFonts w:ascii="Times New Roman" w:eastAsia="Times New Roman" w:hAnsi="Times New Roman" w:cs="Times New Roman"/>
@@ -2831,7 +2733,6 @@
         </w:rPr>
         <w:t xml:space="preserve">JWT (JSON Web Token) es un estándar abierto (RFC 7519) que define un formato compacto y autocontenido para transmitir información entre partes de forma segura mediante un objeto JSON firmado digitalmente. En el contexto de </w:t>
       </w:r>
-      <w:proofErr w:type="spellStart"/>
       <w:r>
         <w:rPr>
           <w:rFonts w:ascii="Times New Roman" w:eastAsia="Times New Roman" w:hAnsi="Times New Roman" w:cs="Times New Roman"/>
@@ -2840,7 +2741,6 @@
         </w:rPr>
         <w:t>CarePet</w:t>
       </w:r>
-      <w:proofErr w:type="spellEnd"/>
       <w:r>
         <w:rPr>
           <w:rFonts w:ascii="Times New Roman" w:eastAsia="Times New Roman" w:hAnsi="Times New Roman" w:cs="Times New Roman"/>
@@ -3048,23 +2948,7 @@
           <w:sz w:val="28"/>
           <w:szCs w:val="28"/>
         </w:rPr>
-        <w:t>3.2.</w:t>
-      </w:r>
-      <w:r>
-        <w:rPr>
-          <w:b/>
-          <w:sz w:val="28"/>
-          <w:szCs w:val="28"/>
-        </w:rPr>
-        <w:t>6</w:t>
-      </w:r>
-      <w:r>
-        <w:rPr>
-          <w:b/>
-          <w:sz w:val="28"/>
-          <w:szCs w:val="28"/>
-        </w:rPr>
-        <w:t xml:space="preserve">.- </w:t>
+        <w:t xml:space="preserve">3.2.6.- </w:t>
       </w:r>
       <w:proofErr w:type="spellStart"/>
       <w:r>
@@ -3197,7 +3081,6 @@
         </w:rPr>
         <w:t xml:space="preserve">Esta característica resulta especialmente relevante en </w:t>
       </w:r>
-      <w:proofErr w:type="spellStart"/>
       <w:r>
         <w:rPr>
           <w:rFonts w:ascii="Times New Roman" w:eastAsia="Times New Roman" w:hAnsi="Times New Roman" w:cs="Times New Roman"/>
@@ -3206,7 +3089,6 @@
         </w:rPr>
         <w:t>CarePet</w:t>
       </w:r>
-      <w:proofErr w:type="spellEnd"/>
       <w:r>
         <w:rPr>
           <w:rFonts w:ascii="Times New Roman" w:eastAsia="Times New Roman" w:hAnsi="Times New Roman" w:cs="Times New Roman"/>
@@ -3273,7 +3155,15 @@
           <w:sz w:val="24"/>
           <w:szCs w:val="24"/>
         </w:rPr>
-        <w:t xml:space="preserve">. Por este motivo se ha optado por </w:t>
+        <w:t xml:space="preserve">. </w:t>
+      </w:r>
+      <w:r>
+        <w:rPr>
+          <w:rFonts w:ascii="Times New Roman" w:eastAsia="Times New Roman" w:hAnsi="Times New Roman" w:cs="Times New Roman"/>
+          <w:sz w:val="24"/>
+          <w:szCs w:val="24"/>
+        </w:rPr>
+        <w:t xml:space="preserve">Por este motivo se ha optado por </w:t>
       </w:r>
       <w:proofErr w:type="spellStart"/>
       <w:r>
@@ -3291,7 +3181,23 @@
           <w:sz w:val="24"/>
           <w:szCs w:val="24"/>
         </w:rPr>
-        <w:t xml:space="preserve"> como solución para la comunicación en tiempo real, si bien su implementación está prevista en una fase posterior del desarrollo del proyecto.</w:t>
+        <w:t xml:space="preserve"> como solución de referencia para la comunicación en tiempo real. No obstante, debido a limitaciones de tiempo en el marco del presente trabajo, esta funcionalidad no ha podido ser implementada en la versión actual de </w:t>
+      </w:r>
+      <w:r>
+        <w:rPr>
+          <w:rFonts w:ascii="Times New Roman" w:eastAsia="Times New Roman" w:hAnsi="Times New Roman" w:cs="Times New Roman"/>
+          <w:sz w:val="24"/>
+          <w:szCs w:val="24"/>
+        </w:rPr>
+        <w:t>CarePet</w:t>
+      </w:r>
+      <w:r>
+        <w:rPr>
+          <w:rFonts w:ascii="Times New Roman" w:eastAsia="Times New Roman" w:hAnsi="Times New Roman" w:cs="Times New Roman"/>
+          <w:sz w:val="24"/>
+          <w:szCs w:val="24"/>
+        </w:rPr>
+        <w:t xml:space="preserve"> y queda planificada como línea de trabajo futuro.</w:t>
       </w:r>
     </w:p>
     <w:p>
@@ -3349,23 +3255,1320 @@
           <w:sz w:val="36"/>
           <w:szCs w:val="36"/>
         </w:rPr>
-        <w:t>3.</w:t>
-      </w:r>
-      <w:r>
+        <w:t>3.3.- Tecnologías del frontend</w:t>
+      </w:r>
+    </w:p>
+    <w:p>
+      <w:pPr>
+        <w:pBdr>
+          <w:top w:val="nil"/>
+          <w:left w:val="nil"/>
+          <w:bottom w:val="nil"/>
+          <w:right w:val="nil"/>
+          <w:between w:val="nil"/>
+        </w:pBdr>
+        <w:jc w:val="both"/>
+        <w:rPr>
+          <w:rFonts w:ascii="Times New Roman" w:eastAsia="Times New Roman" w:hAnsi="Times New Roman" w:cs="Times New Roman"/>
+          <w:sz w:val="24"/>
+          <w:szCs w:val="24"/>
+        </w:rPr>
+      </w:pPr>
+    </w:p>
+    <w:p>
+      <w:pPr>
+        <w:pBdr>
+          <w:top w:val="nil"/>
+          <w:left w:val="nil"/>
+          <w:bottom w:val="nil"/>
+          <w:right w:val="nil"/>
+          <w:between w:val="nil"/>
+        </w:pBdr>
+        <w:jc w:val="both"/>
+        <w:rPr>
+          <w:rFonts w:ascii="Times New Roman" w:eastAsia="Times New Roman" w:hAnsi="Times New Roman" w:cs="Times New Roman"/>
+          <w:sz w:val="24"/>
+          <w:szCs w:val="24"/>
+        </w:rPr>
+      </w:pPr>
+      <w:r>
+        <w:rPr>
+          <w:rFonts w:ascii="Times New Roman" w:eastAsia="Times New Roman" w:hAnsi="Times New Roman" w:cs="Times New Roman"/>
+          <w:sz w:val="24"/>
+          <w:szCs w:val="24"/>
+        </w:rPr>
+        <w:t xml:space="preserve">El frontend de </w:t>
+      </w:r>
+      <w:r>
+        <w:rPr>
+          <w:rFonts w:ascii="Times New Roman" w:eastAsia="Times New Roman" w:hAnsi="Times New Roman" w:cs="Times New Roman"/>
+          <w:sz w:val="24"/>
+          <w:szCs w:val="24"/>
+        </w:rPr>
+        <w:t>CarePet</w:t>
+      </w:r>
+      <w:r>
+        <w:rPr>
+          <w:rFonts w:ascii="Times New Roman" w:eastAsia="Times New Roman" w:hAnsi="Times New Roman" w:cs="Times New Roman"/>
+          <w:sz w:val="24"/>
+          <w:szCs w:val="24"/>
+        </w:rPr>
+        <w:t xml:space="preserve"> es la capa de presentación con la que interactúa directamente el usuario. Está construido como una Single Page Application (SPA), lo que significa que la aplicación se carga una única vez en el navegador y las transiciones entre vistas se gestionan del lado del cliente sin necesidad de recargar la página completa.</w:t>
+      </w:r>
+    </w:p>
+    <w:p>
+      <w:pPr>
+        <w:pBdr>
+          <w:top w:val="nil"/>
+          <w:left w:val="nil"/>
+          <w:bottom w:val="nil"/>
+          <w:right w:val="nil"/>
+          <w:between w:val="nil"/>
+        </w:pBdr>
+        <w:jc w:val="both"/>
+        <w:rPr>
+          <w:rFonts w:ascii="Times New Roman" w:eastAsia="Times New Roman" w:hAnsi="Times New Roman" w:cs="Times New Roman"/>
+          <w:sz w:val="24"/>
+          <w:szCs w:val="24"/>
+        </w:rPr>
+      </w:pPr>
+    </w:p>
+    <w:p>
+      <w:pPr>
+        <w:pBdr>
+          <w:top w:val="nil"/>
+          <w:left w:val="nil"/>
+          <w:bottom w:val="nil"/>
+          <w:right w:val="nil"/>
+          <w:between w:val="nil"/>
+        </w:pBdr>
+        <w:jc w:val="both"/>
+        <w:rPr>
+          <w:rFonts w:ascii="Times New Roman" w:eastAsia="Times New Roman" w:hAnsi="Times New Roman" w:cs="Times New Roman"/>
+          <w:sz w:val="24"/>
+          <w:szCs w:val="24"/>
+        </w:rPr>
+      </w:pPr>
+    </w:p>
+    <w:p>
+      <w:pPr>
+        <w:pBdr>
+          <w:top w:val="nil"/>
+          <w:left w:val="nil"/>
+          <w:bottom w:val="nil"/>
+          <w:right w:val="nil"/>
+          <w:between w:val="nil"/>
+        </w:pBdr>
+        <w:jc w:val="both"/>
+        <w:rPr>
+          <w:b/>
+          <w:sz w:val="28"/>
+          <w:szCs w:val="28"/>
+        </w:rPr>
+      </w:pPr>
+      <w:r>
+        <w:rPr>
+          <w:b/>
+          <w:sz w:val="28"/>
+          <w:szCs w:val="28"/>
+        </w:rPr>
+        <w:t xml:space="preserve">3.3.1.- </w:t>
+      </w:r>
+      <w:r>
+        <w:rPr>
+          <w:b/>
+          <w:sz w:val="28"/>
+          <w:szCs w:val="28"/>
+        </w:rPr>
+        <w:t>React 18</w:t>
+      </w:r>
+    </w:p>
+    <w:p>
+      <w:pPr>
+        <w:pBdr>
+          <w:top w:val="nil"/>
+          <w:left w:val="nil"/>
+          <w:bottom w:val="nil"/>
+          <w:right w:val="nil"/>
+          <w:between w:val="nil"/>
+        </w:pBdr>
+        <w:jc w:val="both"/>
+        <w:rPr>
+          <w:rFonts w:ascii="Times New Roman" w:eastAsia="Times New Roman" w:hAnsi="Times New Roman" w:cs="Times New Roman"/>
+          <w:sz w:val="24"/>
+          <w:szCs w:val="24"/>
+        </w:rPr>
+      </w:pPr>
+    </w:p>
+    <w:p>
+      <w:pPr>
+        <w:pBdr>
+          <w:top w:val="nil"/>
+          <w:left w:val="nil"/>
+          <w:bottom w:val="nil"/>
+          <w:right w:val="nil"/>
+          <w:between w:val="nil"/>
+        </w:pBdr>
+        <w:jc w:val="both"/>
+        <w:rPr>
+          <w:rFonts w:ascii="Times New Roman" w:eastAsia="Times New Roman" w:hAnsi="Times New Roman" w:cs="Times New Roman"/>
+          <w:sz w:val="24"/>
+          <w:szCs w:val="24"/>
+        </w:rPr>
+      </w:pPr>
+      <w:r>
+        <w:rPr>
+          <w:rFonts w:ascii="Times New Roman" w:eastAsia="Times New Roman" w:hAnsi="Times New Roman" w:cs="Times New Roman"/>
+          <w:sz w:val="24"/>
+          <w:szCs w:val="24"/>
+        </w:rPr>
+        <w:t>React es una biblioteca de JavaScript para la construcción de interfaces de usuario, desarrollada y mantenida por Meta. Su modelo de programación se basa en componentes reutilizables: cada parte de la interfaz se encapsula en un componente con su propio estado y lógica, lo que favorece la modularidad y el mantenimiento del código. La versión 18, utilizada en este proyecto, introduce mejoras en el rendimiento mediante el renderizado concurrente y una gestión más eficiente de las actualizaciones de estado.</w:t>
+      </w:r>
+    </w:p>
+    <w:p>
+      <w:pPr>
+        <w:pBdr>
+          <w:top w:val="nil"/>
+          <w:left w:val="nil"/>
+          <w:bottom w:val="nil"/>
+          <w:right w:val="nil"/>
+          <w:between w:val="nil"/>
+        </w:pBdr>
+        <w:jc w:val="both"/>
+        <w:rPr>
+          <w:rFonts w:ascii="Times New Roman" w:eastAsia="Times New Roman" w:hAnsi="Times New Roman" w:cs="Times New Roman"/>
+          <w:sz w:val="24"/>
+          <w:szCs w:val="24"/>
+        </w:rPr>
+      </w:pPr>
+    </w:p>
+    <w:p>
+      <w:pPr>
+        <w:pBdr>
+          <w:top w:val="nil"/>
+          <w:left w:val="nil"/>
+          <w:bottom w:val="nil"/>
+          <w:right w:val="nil"/>
+          <w:between w:val="nil"/>
+        </w:pBdr>
+        <w:jc w:val="both"/>
+        <w:rPr>
+          <w:rFonts w:ascii="Times New Roman" w:eastAsia="Times New Roman" w:hAnsi="Times New Roman" w:cs="Times New Roman"/>
+          <w:sz w:val="24"/>
+          <w:szCs w:val="24"/>
+        </w:rPr>
+      </w:pPr>
+      <w:r>
+        <w:rPr>
+          <w:rFonts w:ascii="Times New Roman" w:eastAsia="Times New Roman" w:hAnsi="Times New Roman" w:cs="Times New Roman"/>
+          <w:sz w:val="24"/>
+          <w:szCs w:val="24"/>
+        </w:rPr>
+        <w:t xml:space="preserve">Las alternativas consideradas fueron Vue.js, Angular, </w:t>
+      </w:r>
+      <w:proofErr w:type="spellStart"/>
+      <w:r>
+        <w:rPr>
+          <w:rFonts w:ascii="Times New Roman" w:eastAsia="Times New Roman" w:hAnsi="Times New Roman" w:cs="Times New Roman"/>
+          <w:sz w:val="24"/>
+          <w:szCs w:val="24"/>
+        </w:rPr>
+        <w:t>Svelte</w:t>
+      </w:r>
+      <w:proofErr w:type="spellEnd"/>
+      <w:r>
+        <w:rPr>
+          <w:rFonts w:ascii="Times New Roman" w:eastAsia="Times New Roman" w:hAnsi="Times New Roman" w:cs="Times New Roman"/>
+          <w:sz w:val="24"/>
+          <w:szCs w:val="24"/>
+        </w:rPr>
+        <w:t xml:space="preserve"> y JavaScript puro sin </w:t>
+      </w:r>
+      <w:proofErr w:type="spellStart"/>
+      <w:r>
+        <w:rPr>
+          <w:rFonts w:ascii="Times New Roman" w:eastAsia="Times New Roman" w:hAnsi="Times New Roman" w:cs="Times New Roman"/>
+          <w:sz w:val="24"/>
+          <w:szCs w:val="24"/>
+        </w:rPr>
+        <w:t>framework</w:t>
+      </w:r>
+      <w:proofErr w:type="spellEnd"/>
+      <w:r>
+        <w:rPr>
+          <w:rFonts w:ascii="Times New Roman" w:eastAsia="Times New Roman" w:hAnsi="Times New Roman" w:cs="Times New Roman"/>
+          <w:sz w:val="24"/>
+          <w:szCs w:val="24"/>
+        </w:rPr>
+        <w:t xml:space="preserve">. React fue seleccionado principalmente por ser el </w:t>
+      </w:r>
+      <w:proofErr w:type="spellStart"/>
+      <w:r>
+        <w:rPr>
+          <w:rFonts w:ascii="Times New Roman" w:eastAsia="Times New Roman" w:hAnsi="Times New Roman" w:cs="Times New Roman"/>
+          <w:sz w:val="24"/>
+          <w:szCs w:val="24"/>
+        </w:rPr>
+        <w:t>framework</w:t>
+      </w:r>
+      <w:proofErr w:type="spellEnd"/>
+      <w:r>
+        <w:rPr>
+          <w:rFonts w:ascii="Times New Roman" w:eastAsia="Times New Roman" w:hAnsi="Times New Roman" w:cs="Times New Roman"/>
+          <w:sz w:val="24"/>
+          <w:szCs w:val="24"/>
+        </w:rPr>
+        <w:t xml:space="preserve"> frontend más demandado en el mercado laboral actual, por la riqueza de su ecosistema de librerías y herramientas, y por el conocimiento previo de la autora. Angular fue descartado por su mayor complejidad y curva de aprendizaje. Vue.js y </w:t>
+      </w:r>
+      <w:proofErr w:type="spellStart"/>
+      <w:r>
+        <w:rPr>
+          <w:rFonts w:ascii="Times New Roman" w:eastAsia="Times New Roman" w:hAnsi="Times New Roman" w:cs="Times New Roman"/>
+          <w:sz w:val="24"/>
+          <w:szCs w:val="24"/>
+        </w:rPr>
+        <w:t>Svelte</w:t>
+      </w:r>
+      <w:proofErr w:type="spellEnd"/>
+      <w:r>
+        <w:rPr>
+          <w:rFonts w:ascii="Times New Roman" w:eastAsia="Times New Roman" w:hAnsi="Times New Roman" w:cs="Times New Roman"/>
+          <w:sz w:val="24"/>
+          <w:szCs w:val="24"/>
+        </w:rPr>
+        <w:t>, aunque son alternativas válidas, cuentan con menor presencia en el mercado laboral español.</w:t>
+      </w:r>
+    </w:p>
+    <w:p>
+      <w:pPr>
+        <w:pBdr>
+          <w:top w:val="nil"/>
+          <w:left w:val="nil"/>
+          <w:bottom w:val="nil"/>
+          <w:right w:val="nil"/>
+          <w:between w:val="nil"/>
+        </w:pBdr>
+        <w:jc w:val="both"/>
+        <w:rPr>
+          <w:rFonts w:ascii="Times New Roman" w:eastAsia="Times New Roman" w:hAnsi="Times New Roman" w:cs="Times New Roman"/>
+          <w:sz w:val="24"/>
+          <w:szCs w:val="24"/>
+        </w:rPr>
+      </w:pPr>
+    </w:p>
+    <w:p>
+      <w:pPr>
+        <w:pBdr>
+          <w:top w:val="nil"/>
+          <w:left w:val="nil"/>
+          <w:bottom w:val="nil"/>
+          <w:right w:val="nil"/>
+          <w:between w:val="nil"/>
+        </w:pBdr>
+        <w:jc w:val="both"/>
+        <w:rPr>
+          <w:rFonts w:ascii="Times New Roman" w:eastAsia="Times New Roman" w:hAnsi="Times New Roman" w:cs="Times New Roman"/>
+          <w:sz w:val="24"/>
+          <w:szCs w:val="24"/>
+        </w:rPr>
+      </w:pPr>
+      <w:r>
+        <w:rPr>
+          <w:rFonts w:ascii="Times New Roman" w:eastAsia="Times New Roman" w:hAnsi="Times New Roman" w:cs="Times New Roman"/>
+          <w:sz w:val="24"/>
+          <w:szCs w:val="24"/>
+        </w:rPr>
+        <w:lastRenderedPageBreak/>
+        <w:t xml:space="preserve">En </w:t>
+      </w:r>
+      <w:r>
+        <w:rPr>
+          <w:rFonts w:ascii="Times New Roman" w:eastAsia="Times New Roman" w:hAnsi="Times New Roman" w:cs="Times New Roman"/>
+          <w:sz w:val="24"/>
+          <w:szCs w:val="24"/>
+        </w:rPr>
+        <w:t>CarePet</w:t>
+      </w:r>
+      <w:r>
+        <w:rPr>
+          <w:rFonts w:ascii="Times New Roman" w:eastAsia="Times New Roman" w:hAnsi="Times New Roman" w:cs="Times New Roman"/>
+          <w:sz w:val="24"/>
+          <w:szCs w:val="24"/>
+        </w:rPr>
+        <w:t xml:space="preserve">, React gestiona toda la capa de presentación mediante componentes funcionales con Hooks. El Hook </w:t>
+      </w:r>
+      <w:proofErr w:type="spellStart"/>
+      <w:r>
+        <w:rPr>
+          <w:rFonts w:ascii="Times New Roman" w:eastAsia="Times New Roman" w:hAnsi="Times New Roman" w:cs="Times New Roman"/>
+          <w:sz w:val="24"/>
+          <w:szCs w:val="24"/>
+        </w:rPr>
+        <w:t>useState</w:t>
+      </w:r>
+      <w:proofErr w:type="spellEnd"/>
+      <w:r>
+        <w:rPr>
+          <w:rFonts w:ascii="Times New Roman" w:eastAsia="Times New Roman" w:hAnsi="Times New Roman" w:cs="Times New Roman"/>
+          <w:sz w:val="24"/>
+          <w:szCs w:val="24"/>
+        </w:rPr>
+        <w:t xml:space="preserve"> se utiliza para la gestión del estado local de los componentes, </w:t>
+      </w:r>
+      <w:proofErr w:type="spellStart"/>
+      <w:r>
+        <w:rPr>
+          <w:rFonts w:ascii="Times New Roman" w:eastAsia="Times New Roman" w:hAnsi="Times New Roman" w:cs="Times New Roman"/>
+          <w:sz w:val="24"/>
+          <w:szCs w:val="24"/>
+        </w:rPr>
+        <w:t>useEffect</w:t>
+      </w:r>
+      <w:proofErr w:type="spellEnd"/>
+      <w:r>
+        <w:rPr>
+          <w:rFonts w:ascii="Times New Roman" w:eastAsia="Times New Roman" w:hAnsi="Times New Roman" w:cs="Times New Roman"/>
+          <w:sz w:val="24"/>
+          <w:szCs w:val="24"/>
+        </w:rPr>
+        <w:t xml:space="preserve"> para los efectos secundarios como las llamadas a la API, y </w:t>
+      </w:r>
+      <w:proofErr w:type="spellStart"/>
+      <w:r>
+        <w:rPr>
+          <w:rFonts w:ascii="Times New Roman" w:eastAsia="Times New Roman" w:hAnsi="Times New Roman" w:cs="Times New Roman"/>
+          <w:sz w:val="24"/>
+          <w:szCs w:val="24"/>
+        </w:rPr>
+        <w:t>useContext</w:t>
+      </w:r>
+      <w:proofErr w:type="spellEnd"/>
+      <w:r>
+        <w:rPr>
+          <w:rFonts w:ascii="Times New Roman" w:eastAsia="Times New Roman" w:hAnsi="Times New Roman" w:cs="Times New Roman"/>
+          <w:sz w:val="24"/>
+          <w:szCs w:val="24"/>
+        </w:rPr>
+        <w:t xml:space="preserve"> para compartir el estado de autenticación entre componentes sin necesidad de pasar propiedades manualmente a través de múltiples niveles del árbol de componentes.</w:t>
+      </w:r>
+    </w:p>
+    <w:p>
+      <w:pPr>
+        <w:pBdr>
+          <w:top w:val="nil"/>
+          <w:left w:val="nil"/>
+          <w:bottom w:val="nil"/>
+          <w:right w:val="nil"/>
+          <w:between w:val="nil"/>
+        </w:pBdr>
+        <w:jc w:val="both"/>
+        <w:rPr>
+          <w:rFonts w:ascii="Times New Roman" w:eastAsia="Times New Roman" w:hAnsi="Times New Roman" w:cs="Times New Roman"/>
+          <w:sz w:val="24"/>
+          <w:szCs w:val="24"/>
+        </w:rPr>
+      </w:pPr>
+    </w:p>
+    <w:p>
+      <w:pPr>
+        <w:pBdr>
+          <w:top w:val="nil"/>
+          <w:left w:val="nil"/>
+          <w:bottom w:val="nil"/>
+          <w:right w:val="nil"/>
+          <w:between w:val="nil"/>
+        </w:pBdr>
+        <w:jc w:val="both"/>
+        <w:rPr>
+          <w:rFonts w:ascii="Times New Roman" w:eastAsia="Times New Roman" w:hAnsi="Times New Roman" w:cs="Times New Roman"/>
+          <w:sz w:val="24"/>
+          <w:szCs w:val="24"/>
+        </w:rPr>
+      </w:pPr>
+    </w:p>
+    <w:p>
+      <w:pPr>
+        <w:pBdr>
+          <w:top w:val="nil"/>
+          <w:left w:val="nil"/>
+          <w:bottom w:val="nil"/>
+          <w:right w:val="nil"/>
+          <w:between w:val="nil"/>
+        </w:pBdr>
+        <w:jc w:val="both"/>
+        <w:rPr>
+          <w:b/>
+          <w:sz w:val="28"/>
+          <w:szCs w:val="28"/>
+        </w:rPr>
+      </w:pPr>
+      <w:r>
+        <w:rPr>
+          <w:b/>
+          <w:sz w:val="28"/>
+          <w:szCs w:val="28"/>
+        </w:rPr>
+        <w:t>3.3.</w:t>
+      </w:r>
+      <w:r>
+        <w:rPr>
+          <w:b/>
+          <w:sz w:val="28"/>
+          <w:szCs w:val="28"/>
+        </w:rPr>
+        <w:t>2</w:t>
+      </w:r>
+      <w:r>
+        <w:rPr>
+          <w:b/>
+          <w:sz w:val="28"/>
+          <w:szCs w:val="28"/>
+        </w:rPr>
+        <w:t xml:space="preserve">.- </w:t>
+      </w:r>
+      <w:proofErr w:type="spellStart"/>
+      <w:r>
+        <w:rPr>
+          <w:b/>
+          <w:sz w:val="28"/>
+          <w:szCs w:val="28"/>
+        </w:rPr>
+        <w:t>Tailwind</w:t>
+      </w:r>
+      <w:proofErr w:type="spellEnd"/>
+      <w:r>
+        <w:rPr>
+          <w:b/>
+          <w:sz w:val="28"/>
+          <w:szCs w:val="28"/>
+        </w:rPr>
+        <w:t xml:space="preserve"> CSS</w:t>
+      </w:r>
+    </w:p>
+    <w:p>
+      <w:pPr>
+        <w:pBdr>
+          <w:top w:val="nil"/>
+          <w:left w:val="nil"/>
+          <w:bottom w:val="nil"/>
+          <w:right w:val="nil"/>
+          <w:between w:val="nil"/>
+        </w:pBdr>
+        <w:jc w:val="both"/>
+        <w:rPr>
+          <w:rFonts w:ascii="Times New Roman" w:eastAsia="Times New Roman" w:hAnsi="Times New Roman" w:cs="Times New Roman"/>
+          <w:sz w:val="24"/>
+          <w:szCs w:val="24"/>
+        </w:rPr>
+      </w:pPr>
+    </w:p>
+    <w:p>
+      <w:pPr>
+        <w:pBdr>
+          <w:top w:val="nil"/>
+          <w:left w:val="nil"/>
+          <w:bottom w:val="nil"/>
+          <w:right w:val="nil"/>
+          <w:between w:val="nil"/>
+        </w:pBdr>
+        <w:jc w:val="both"/>
+        <w:rPr>
+          <w:rFonts w:ascii="Times New Roman" w:eastAsia="Times New Roman" w:hAnsi="Times New Roman" w:cs="Times New Roman"/>
+          <w:sz w:val="24"/>
+          <w:szCs w:val="24"/>
+        </w:rPr>
+      </w:pPr>
+      <w:proofErr w:type="spellStart"/>
+      <w:r>
+        <w:rPr>
+          <w:rFonts w:ascii="Times New Roman" w:eastAsia="Times New Roman" w:hAnsi="Times New Roman" w:cs="Times New Roman"/>
+          <w:sz w:val="24"/>
+          <w:szCs w:val="24"/>
+        </w:rPr>
+        <w:t>Tailwind</w:t>
+      </w:r>
+      <w:proofErr w:type="spellEnd"/>
+      <w:r>
+        <w:rPr>
+          <w:rFonts w:ascii="Times New Roman" w:eastAsia="Times New Roman" w:hAnsi="Times New Roman" w:cs="Times New Roman"/>
+          <w:sz w:val="24"/>
+          <w:szCs w:val="24"/>
+        </w:rPr>
+        <w:t xml:space="preserve"> CSS es un </w:t>
+      </w:r>
+      <w:proofErr w:type="spellStart"/>
+      <w:r>
+        <w:rPr>
+          <w:rFonts w:ascii="Times New Roman" w:eastAsia="Times New Roman" w:hAnsi="Times New Roman" w:cs="Times New Roman"/>
+          <w:sz w:val="24"/>
+          <w:szCs w:val="24"/>
+        </w:rPr>
+        <w:t>framework</w:t>
+      </w:r>
+      <w:proofErr w:type="spellEnd"/>
+      <w:r>
+        <w:rPr>
+          <w:rFonts w:ascii="Times New Roman" w:eastAsia="Times New Roman" w:hAnsi="Times New Roman" w:cs="Times New Roman"/>
+          <w:sz w:val="24"/>
+          <w:szCs w:val="24"/>
+        </w:rPr>
+        <w:t xml:space="preserve"> de estilos CSS basado en el enfoque </w:t>
+      </w:r>
+      <w:proofErr w:type="spellStart"/>
+      <w:r>
+        <w:rPr>
+          <w:rFonts w:ascii="Times New Roman" w:eastAsia="Times New Roman" w:hAnsi="Times New Roman" w:cs="Times New Roman"/>
+          <w:sz w:val="24"/>
+          <w:szCs w:val="24"/>
+        </w:rPr>
+        <w:t>utility-first</w:t>
+      </w:r>
+      <w:proofErr w:type="spellEnd"/>
+      <w:r>
+        <w:rPr>
+          <w:rFonts w:ascii="Times New Roman" w:eastAsia="Times New Roman" w:hAnsi="Times New Roman" w:cs="Times New Roman"/>
+          <w:sz w:val="24"/>
+          <w:szCs w:val="24"/>
+        </w:rPr>
+        <w:t>, en el que los estilos se aplican directamente en el HTML mediante clases de utilidad predefinidas en lugar de escribir hojas de estilo personalizadas. Esto permite construir interfaces visuales complejas y consistentes sin necesidad de abandonar el archivo de plantilla.</w:t>
+      </w:r>
+    </w:p>
+    <w:p>
+      <w:pPr>
+        <w:pBdr>
+          <w:top w:val="nil"/>
+          <w:left w:val="nil"/>
+          <w:bottom w:val="nil"/>
+          <w:right w:val="nil"/>
+          <w:between w:val="nil"/>
+        </w:pBdr>
+        <w:jc w:val="both"/>
+        <w:rPr>
+          <w:rFonts w:ascii="Times New Roman" w:eastAsia="Times New Roman" w:hAnsi="Times New Roman" w:cs="Times New Roman"/>
+          <w:sz w:val="24"/>
+          <w:szCs w:val="24"/>
+        </w:rPr>
+      </w:pPr>
+    </w:p>
+    <w:p>
+      <w:pPr>
+        <w:pBdr>
+          <w:top w:val="nil"/>
+          <w:left w:val="nil"/>
+          <w:bottom w:val="nil"/>
+          <w:right w:val="nil"/>
+          <w:between w:val="nil"/>
+        </w:pBdr>
+        <w:jc w:val="both"/>
+        <w:rPr>
+          <w:rFonts w:ascii="Times New Roman" w:eastAsia="Times New Roman" w:hAnsi="Times New Roman" w:cs="Times New Roman"/>
+          <w:sz w:val="24"/>
+          <w:szCs w:val="24"/>
+        </w:rPr>
+      </w:pPr>
+      <w:r>
+        <w:rPr>
+          <w:rFonts w:ascii="Times New Roman" w:eastAsia="Times New Roman" w:hAnsi="Times New Roman" w:cs="Times New Roman"/>
+          <w:sz w:val="24"/>
+          <w:szCs w:val="24"/>
+        </w:rPr>
+        <w:t xml:space="preserve">Las alternativas consideradas fueron CSS puro, Bootstrap, Material-UI y </w:t>
+      </w:r>
+      <w:proofErr w:type="spellStart"/>
+      <w:r>
+        <w:rPr>
+          <w:rFonts w:ascii="Times New Roman" w:eastAsia="Times New Roman" w:hAnsi="Times New Roman" w:cs="Times New Roman"/>
+          <w:sz w:val="24"/>
+          <w:szCs w:val="24"/>
+        </w:rPr>
+        <w:t>Styled</w:t>
+      </w:r>
+      <w:proofErr w:type="spellEnd"/>
+      <w:r>
+        <w:rPr>
+          <w:rFonts w:ascii="Times New Roman" w:eastAsia="Times New Roman" w:hAnsi="Times New Roman" w:cs="Times New Roman"/>
+          <w:sz w:val="24"/>
+          <w:szCs w:val="24"/>
+        </w:rPr>
+        <w:t xml:space="preserve"> </w:t>
+      </w:r>
+      <w:proofErr w:type="spellStart"/>
+      <w:r>
+        <w:rPr>
+          <w:rFonts w:ascii="Times New Roman" w:eastAsia="Times New Roman" w:hAnsi="Times New Roman" w:cs="Times New Roman"/>
+          <w:sz w:val="24"/>
+          <w:szCs w:val="24"/>
+        </w:rPr>
+        <w:t>Components</w:t>
+      </w:r>
+      <w:proofErr w:type="spellEnd"/>
+      <w:r>
+        <w:rPr>
+          <w:rFonts w:ascii="Times New Roman" w:eastAsia="Times New Roman" w:hAnsi="Times New Roman" w:cs="Times New Roman"/>
+          <w:sz w:val="24"/>
+          <w:szCs w:val="24"/>
+        </w:rPr>
+        <w:t xml:space="preserve">. </w:t>
+      </w:r>
+      <w:proofErr w:type="spellStart"/>
+      <w:r>
+        <w:rPr>
+          <w:rFonts w:ascii="Times New Roman" w:eastAsia="Times New Roman" w:hAnsi="Times New Roman" w:cs="Times New Roman"/>
+          <w:sz w:val="24"/>
+          <w:szCs w:val="24"/>
+        </w:rPr>
+        <w:t>Tailwind</w:t>
+      </w:r>
+      <w:proofErr w:type="spellEnd"/>
+      <w:r>
+        <w:rPr>
+          <w:rFonts w:ascii="Times New Roman" w:eastAsia="Times New Roman" w:hAnsi="Times New Roman" w:cs="Times New Roman"/>
+          <w:sz w:val="24"/>
+          <w:szCs w:val="24"/>
+        </w:rPr>
+        <w:t xml:space="preserve"> fue elegido por su flexibilidad, su capacidad para generar interfaces modernas y personalizadas sin imponer un sistema de diseño predefinido como hace Bootstrap, y por su integración nativa con Vite. Además, </w:t>
+      </w:r>
+      <w:proofErr w:type="spellStart"/>
+      <w:r>
+        <w:rPr>
+          <w:rFonts w:ascii="Times New Roman" w:eastAsia="Times New Roman" w:hAnsi="Times New Roman" w:cs="Times New Roman"/>
+          <w:sz w:val="24"/>
+          <w:szCs w:val="24"/>
+        </w:rPr>
+        <w:t>Tailwind</w:t>
+      </w:r>
+      <w:proofErr w:type="spellEnd"/>
+      <w:r>
+        <w:rPr>
+          <w:rFonts w:ascii="Times New Roman" w:eastAsia="Times New Roman" w:hAnsi="Times New Roman" w:cs="Times New Roman"/>
+          <w:sz w:val="24"/>
+          <w:szCs w:val="24"/>
+        </w:rPr>
+        <w:t xml:space="preserve"> incluye soporte nativo para diseño responsive mediante prefijos de </w:t>
+      </w:r>
+      <w:proofErr w:type="spellStart"/>
+      <w:r>
+        <w:rPr>
+          <w:rFonts w:ascii="Times New Roman" w:eastAsia="Times New Roman" w:hAnsi="Times New Roman" w:cs="Times New Roman"/>
+          <w:sz w:val="24"/>
+          <w:szCs w:val="24"/>
+        </w:rPr>
+        <w:t>breakpoint</w:t>
+      </w:r>
+      <w:proofErr w:type="spellEnd"/>
+      <w:r>
+        <w:rPr>
+          <w:rFonts w:ascii="Times New Roman" w:eastAsia="Times New Roman" w:hAnsi="Times New Roman" w:cs="Times New Roman"/>
+          <w:sz w:val="24"/>
+          <w:szCs w:val="24"/>
+        </w:rPr>
+        <w:t xml:space="preserve"> como </w:t>
+      </w:r>
+      <w:proofErr w:type="spellStart"/>
+      <w:proofErr w:type="gramStart"/>
+      <w:r>
+        <w:rPr>
+          <w:rFonts w:ascii="Times New Roman" w:eastAsia="Times New Roman" w:hAnsi="Times New Roman" w:cs="Times New Roman"/>
+          <w:sz w:val="24"/>
+          <w:szCs w:val="24"/>
+        </w:rPr>
+        <w:t>sm</w:t>
+      </w:r>
+      <w:proofErr w:type="spellEnd"/>
+      <w:r>
+        <w:rPr>
+          <w:rFonts w:ascii="Times New Roman" w:eastAsia="Times New Roman" w:hAnsi="Times New Roman" w:cs="Times New Roman"/>
+          <w:sz w:val="24"/>
+          <w:szCs w:val="24"/>
+        </w:rPr>
+        <w:t>:,</w:t>
+      </w:r>
+      <w:proofErr w:type="gramEnd"/>
+      <w:r>
+        <w:rPr>
+          <w:rFonts w:ascii="Times New Roman" w:eastAsia="Times New Roman" w:hAnsi="Times New Roman" w:cs="Times New Roman"/>
+          <w:sz w:val="24"/>
+          <w:szCs w:val="24"/>
+        </w:rPr>
+        <w:t xml:space="preserve"> </w:t>
+      </w:r>
+      <w:proofErr w:type="spellStart"/>
+      <w:r>
+        <w:rPr>
+          <w:rFonts w:ascii="Times New Roman" w:eastAsia="Times New Roman" w:hAnsi="Times New Roman" w:cs="Times New Roman"/>
+          <w:sz w:val="24"/>
+          <w:szCs w:val="24"/>
+        </w:rPr>
+        <w:t>md</w:t>
+      </w:r>
+      <w:proofErr w:type="spellEnd"/>
+      <w:r>
+        <w:rPr>
+          <w:rFonts w:ascii="Times New Roman" w:eastAsia="Times New Roman" w:hAnsi="Times New Roman" w:cs="Times New Roman"/>
+          <w:sz w:val="24"/>
+          <w:szCs w:val="24"/>
+        </w:rPr>
+        <w:t xml:space="preserve">: o </w:t>
+      </w:r>
+      <w:proofErr w:type="spellStart"/>
+      <w:proofErr w:type="gramStart"/>
+      <w:r>
+        <w:rPr>
+          <w:rFonts w:ascii="Times New Roman" w:eastAsia="Times New Roman" w:hAnsi="Times New Roman" w:cs="Times New Roman"/>
+          <w:sz w:val="24"/>
+          <w:szCs w:val="24"/>
+        </w:rPr>
+        <w:t>lg</w:t>
+      </w:r>
+      <w:proofErr w:type="spellEnd"/>
+      <w:r>
+        <w:rPr>
+          <w:rFonts w:ascii="Times New Roman" w:eastAsia="Times New Roman" w:hAnsi="Times New Roman" w:cs="Times New Roman"/>
+          <w:sz w:val="24"/>
+          <w:szCs w:val="24"/>
+        </w:rPr>
+        <w:t>:,</w:t>
+      </w:r>
+      <w:proofErr w:type="gramEnd"/>
+      <w:r>
+        <w:rPr>
+          <w:rFonts w:ascii="Times New Roman" w:eastAsia="Times New Roman" w:hAnsi="Times New Roman" w:cs="Times New Roman"/>
+          <w:sz w:val="24"/>
+          <w:szCs w:val="24"/>
+        </w:rPr>
+        <w:t xml:space="preserve"> lo que facilita considerablemente la adaptación de la interfaz a distintos tamaños de pantalla, un requisito fundamental para que </w:t>
+      </w:r>
+      <w:r>
+        <w:rPr>
+          <w:rFonts w:ascii="Times New Roman" w:eastAsia="Times New Roman" w:hAnsi="Times New Roman" w:cs="Times New Roman"/>
+          <w:sz w:val="24"/>
+          <w:szCs w:val="24"/>
+        </w:rPr>
+        <w:t>CarePet</w:t>
+      </w:r>
+      <w:r>
+        <w:rPr>
+          <w:rFonts w:ascii="Times New Roman" w:eastAsia="Times New Roman" w:hAnsi="Times New Roman" w:cs="Times New Roman"/>
+          <w:sz w:val="24"/>
+          <w:szCs w:val="24"/>
+        </w:rPr>
+        <w:t xml:space="preserve"> funcione correctamente como PWA en dispositivos móviles y de escritorio.</w:t>
+      </w:r>
+    </w:p>
+    <w:p>
+      <w:pPr>
+        <w:pBdr>
+          <w:top w:val="nil"/>
+          <w:left w:val="nil"/>
+          <w:bottom w:val="nil"/>
+          <w:right w:val="nil"/>
+          <w:between w:val="nil"/>
+        </w:pBdr>
+        <w:jc w:val="both"/>
+        <w:rPr>
+          <w:rFonts w:ascii="Times New Roman" w:eastAsia="Times New Roman" w:hAnsi="Times New Roman" w:cs="Times New Roman"/>
+          <w:sz w:val="24"/>
+          <w:szCs w:val="24"/>
+        </w:rPr>
+      </w:pPr>
+    </w:p>
+    <w:p>
+      <w:pPr>
+        <w:pBdr>
+          <w:top w:val="nil"/>
+          <w:left w:val="nil"/>
+          <w:bottom w:val="nil"/>
+          <w:right w:val="nil"/>
+          <w:between w:val="nil"/>
+        </w:pBdr>
+        <w:jc w:val="both"/>
+        <w:rPr>
+          <w:rFonts w:ascii="Times New Roman" w:eastAsia="Times New Roman" w:hAnsi="Times New Roman" w:cs="Times New Roman"/>
+          <w:sz w:val="24"/>
+          <w:szCs w:val="24"/>
+        </w:rPr>
+      </w:pPr>
+    </w:p>
+    <w:p>
+      <w:pPr>
+        <w:pBdr>
+          <w:top w:val="nil"/>
+          <w:left w:val="nil"/>
+          <w:bottom w:val="nil"/>
+          <w:right w:val="nil"/>
+          <w:between w:val="nil"/>
+        </w:pBdr>
+        <w:jc w:val="both"/>
+        <w:rPr>
+          <w:b/>
+          <w:sz w:val="28"/>
+          <w:szCs w:val="28"/>
+        </w:rPr>
+      </w:pPr>
+      <w:r>
+        <w:rPr>
+          <w:b/>
+          <w:sz w:val="28"/>
+          <w:szCs w:val="28"/>
+        </w:rPr>
+        <w:t>3.3.</w:t>
+      </w:r>
+      <w:r>
+        <w:rPr>
+          <w:b/>
+          <w:sz w:val="28"/>
+          <w:szCs w:val="28"/>
+        </w:rPr>
+        <w:t>3</w:t>
+      </w:r>
+      <w:r>
+        <w:rPr>
+          <w:b/>
+          <w:sz w:val="28"/>
+          <w:szCs w:val="28"/>
+        </w:rPr>
+        <w:t xml:space="preserve">.- </w:t>
+      </w:r>
+      <w:r>
+        <w:rPr>
+          <w:b/>
+          <w:sz w:val="28"/>
+          <w:szCs w:val="28"/>
+        </w:rPr>
+        <w:t>Vite</w:t>
+      </w:r>
+    </w:p>
+    <w:p>
+      <w:pPr>
+        <w:pBdr>
+          <w:top w:val="nil"/>
+          <w:left w:val="nil"/>
+          <w:bottom w:val="nil"/>
+          <w:right w:val="nil"/>
+          <w:between w:val="nil"/>
+        </w:pBdr>
+        <w:jc w:val="both"/>
+        <w:rPr>
+          <w:rFonts w:ascii="Times New Roman" w:eastAsia="Times New Roman" w:hAnsi="Times New Roman" w:cs="Times New Roman"/>
+          <w:sz w:val="24"/>
+          <w:szCs w:val="24"/>
+        </w:rPr>
+      </w:pPr>
+    </w:p>
+    <w:p>
+      <w:pPr>
+        <w:pBdr>
+          <w:top w:val="nil"/>
+          <w:left w:val="nil"/>
+          <w:bottom w:val="nil"/>
+          <w:right w:val="nil"/>
+          <w:between w:val="nil"/>
+        </w:pBdr>
+        <w:jc w:val="both"/>
+        <w:rPr>
+          <w:rFonts w:ascii="Times New Roman" w:eastAsia="Times New Roman" w:hAnsi="Times New Roman" w:cs="Times New Roman"/>
+          <w:sz w:val="24"/>
+          <w:szCs w:val="24"/>
+        </w:rPr>
+      </w:pPr>
+      <w:r>
+        <w:rPr>
+          <w:rFonts w:ascii="Times New Roman" w:eastAsia="Times New Roman" w:hAnsi="Times New Roman" w:cs="Times New Roman"/>
+          <w:sz w:val="24"/>
+          <w:szCs w:val="24"/>
+        </w:rPr>
+        <w:t xml:space="preserve">Vite es una herramienta de construcción y desarrollo para aplicaciones web modernas que destaca por su velocidad. A diferencia de herramientas anteriores como </w:t>
+      </w:r>
+      <w:proofErr w:type="spellStart"/>
+      <w:r>
+        <w:rPr>
+          <w:rFonts w:ascii="Times New Roman" w:eastAsia="Times New Roman" w:hAnsi="Times New Roman" w:cs="Times New Roman"/>
+          <w:sz w:val="24"/>
+          <w:szCs w:val="24"/>
+        </w:rPr>
+        <w:t>Webpack</w:t>
+      </w:r>
+      <w:proofErr w:type="spellEnd"/>
+      <w:r>
+        <w:rPr>
+          <w:rFonts w:ascii="Times New Roman" w:eastAsia="Times New Roman" w:hAnsi="Times New Roman" w:cs="Times New Roman"/>
+          <w:sz w:val="24"/>
+          <w:szCs w:val="24"/>
+        </w:rPr>
+        <w:t xml:space="preserve"> o </w:t>
+      </w:r>
+      <w:proofErr w:type="spellStart"/>
+      <w:r>
+        <w:rPr>
+          <w:rFonts w:ascii="Times New Roman" w:eastAsia="Times New Roman" w:hAnsi="Times New Roman" w:cs="Times New Roman"/>
+          <w:sz w:val="24"/>
+          <w:szCs w:val="24"/>
+        </w:rPr>
+        <w:t>Create</w:t>
+      </w:r>
+      <w:proofErr w:type="spellEnd"/>
+      <w:r>
+        <w:rPr>
+          <w:rFonts w:ascii="Times New Roman" w:eastAsia="Times New Roman" w:hAnsi="Times New Roman" w:cs="Times New Roman"/>
+          <w:sz w:val="24"/>
+          <w:szCs w:val="24"/>
+        </w:rPr>
+        <w:t xml:space="preserve"> React App, Vite aprovecha los módulos ES nativos del navegador para servir el código fuente durante el desarrollo sin necesidad de empaquetarlo previamente, lo que reduce el tiempo de arranque del servidor de desarrollo a menos de un segundo independientemente del tamaño del proyecto.</w:t>
+      </w:r>
+    </w:p>
+    <w:p>
+      <w:pPr>
+        <w:pBdr>
+          <w:top w:val="nil"/>
+          <w:left w:val="nil"/>
+          <w:bottom w:val="nil"/>
+          <w:right w:val="nil"/>
+          <w:between w:val="nil"/>
+        </w:pBdr>
+        <w:jc w:val="both"/>
+        <w:rPr>
+          <w:rFonts w:ascii="Times New Roman" w:eastAsia="Times New Roman" w:hAnsi="Times New Roman" w:cs="Times New Roman"/>
+          <w:sz w:val="24"/>
+          <w:szCs w:val="24"/>
+        </w:rPr>
+      </w:pPr>
+      <w:proofErr w:type="spellStart"/>
+      <w:r>
+        <w:rPr>
+          <w:rFonts w:ascii="Times New Roman" w:eastAsia="Times New Roman" w:hAnsi="Times New Roman" w:cs="Times New Roman"/>
+          <w:sz w:val="24"/>
+          <w:szCs w:val="24"/>
+        </w:rPr>
+        <w:t>Create</w:t>
+      </w:r>
+      <w:proofErr w:type="spellEnd"/>
+      <w:r>
+        <w:rPr>
+          <w:rFonts w:ascii="Times New Roman" w:eastAsia="Times New Roman" w:hAnsi="Times New Roman" w:cs="Times New Roman"/>
+          <w:sz w:val="24"/>
+          <w:szCs w:val="24"/>
+        </w:rPr>
+        <w:t xml:space="preserve"> React App (CRA) fue la alternativa principal considerada, pero fue descartada dado que está actualmente en proceso de desuso y ya no recibe actualizaciones activas por parte de la comunidad React. </w:t>
+      </w:r>
+      <w:proofErr w:type="spellStart"/>
+      <w:r>
+        <w:rPr>
+          <w:rFonts w:ascii="Times New Roman" w:eastAsia="Times New Roman" w:hAnsi="Times New Roman" w:cs="Times New Roman"/>
+          <w:sz w:val="24"/>
+          <w:szCs w:val="24"/>
+        </w:rPr>
+        <w:t>Webpack</w:t>
+      </w:r>
+      <w:proofErr w:type="spellEnd"/>
+      <w:r>
+        <w:rPr>
+          <w:rFonts w:ascii="Times New Roman" w:eastAsia="Times New Roman" w:hAnsi="Times New Roman" w:cs="Times New Roman"/>
+          <w:sz w:val="24"/>
+          <w:szCs w:val="24"/>
+        </w:rPr>
+        <w:t xml:space="preserve"> fue descartado por su complejidad de configuración. Vite se ha consolidado como el estándar de facto para nuevos proyectos React y cuenta con soporte oficial en la documentación de React. En </w:t>
+      </w:r>
+      <w:r>
+        <w:rPr>
+          <w:rFonts w:ascii="Times New Roman" w:eastAsia="Times New Roman" w:hAnsi="Times New Roman" w:cs="Times New Roman"/>
+          <w:sz w:val="24"/>
+          <w:szCs w:val="24"/>
+        </w:rPr>
+        <w:t>CarePet</w:t>
+      </w:r>
+      <w:r>
+        <w:rPr>
+          <w:rFonts w:ascii="Times New Roman" w:eastAsia="Times New Roman" w:hAnsi="Times New Roman" w:cs="Times New Roman"/>
+          <w:sz w:val="24"/>
+          <w:szCs w:val="24"/>
+        </w:rPr>
+        <w:t xml:space="preserve">, Vite gestiona el servidor de desarrollo con recarga en caliente (HMR) y genera el </w:t>
+      </w:r>
+      <w:proofErr w:type="spellStart"/>
+      <w:r>
+        <w:rPr>
+          <w:rFonts w:ascii="Times New Roman" w:eastAsia="Times New Roman" w:hAnsi="Times New Roman" w:cs="Times New Roman"/>
+          <w:sz w:val="24"/>
+          <w:szCs w:val="24"/>
+        </w:rPr>
+        <w:t>bundle</w:t>
+      </w:r>
+      <w:proofErr w:type="spellEnd"/>
+      <w:r>
+        <w:rPr>
+          <w:rFonts w:ascii="Times New Roman" w:eastAsia="Times New Roman" w:hAnsi="Times New Roman" w:cs="Times New Roman"/>
+          <w:sz w:val="24"/>
+          <w:szCs w:val="24"/>
+        </w:rPr>
+        <w:t xml:space="preserve"> optimizado para producción que se despliega en </w:t>
+      </w:r>
+      <w:proofErr w:type="spellStart"/>
+      <w:r>
+        <w:rPr>
+          <w:rFonts w:ascii="Times New Roman" w:eastAsia="Times New Roman" w:hAnsi="Times New Roman" w:cs="Times New Roman"/>
+          <w:sz w:val="24"/>
+          <w:szCs w:val="24"/>
+        </w:rPr>
+        <w:t>Vercel</w:t>
+      </w:r>
+      <w:proofErr w:type="spellEnd"/>
+      <w:r>
+        <w:rPr>
+          <w:rFonts w:ascii="Times New Roman" w:eastAsia="Times New Roman" w:hAnsi="Times New Roman" w:cs="Times New Roman"/>
+          <w:sz w:val="24"/>
+          <w:szCs w:val="24"/>
+        </w:rPr>
+        <w:t xml:space="preserve">. Adicionalmente, durante el desarrollo se utiliza la funcionalidad de proxy integrada en Vite, que permite redirigir las peticiones del frontend al backend de forma transparente sin necesidad de configurar CORS manualmente en el entorno local. Esta configuración se define en el archivo vite.config.js y evita los errores de política de mismo </w:t>
+      </w:r>
+      <w:r>
+        <w:rPr>
+          <w:rFonts w:ascii="Times New Roman" w:eastAsia="Times New Roman" w:hAnsi="Times New Roman" w:cs="Times New Roman"/>
+          <w:sz w:val="24"/>
+          <w:szCs w:val="24"/>
+        </w:rPr>
+        <w:lastRenderedPageBreak/>
+        <w:t>origen que surgirían al acceder directamente desde el frontend al backend cuando ambos se ejecutan en puertos distintos durante el desarrollo.</w:t>
+      </w:r>
+    </w:p>
+    <w:p>
+      <w:pPr>
+        <w:pBdr>
+          <w:top w:val="nil"/>
+          <w:left w:val="nil"/>
+          <w:bottom w:val="nil"/>
+          <w:right w:val="nil"/>
+          <w:between w:val="nil"/>
+        </w:pBdr>
+        <w:jc w:val="both"/>
+        <w:rPr>
+          <w:rFonts w:ascii="Times New Roman" w:eastAsia="Times New Roman" w:hAnsi="Times New Roman" w:cs="Times New Roman"/>
+          <w:sz w:val="24"/>
+          <w:szCs w:val="24"/>
+        </w:rPr>
+      </w:pPr>
+    </w:p>
+    <w:p>
+      <w:pPr>
+        <w:pBdr>
+          <w:top w:val="nil"/>
+          <w:left w:val="nil"/>
+          <w:bottom w:val="nil"/>
+          <w:right w:val="nil"/>
+          <w:between w:val="nil"/>
+        </w:pBdr>
+        <w:jc w:val="both"/>
+        <w:rPr>
+          <w:rFonts w:ascii="Times New Roman" w:eastAsia="Times New Roman" w:hAnsi="Times New Roman" w:cs="Times New Roman"/>
+          <w:sz w:val="24"/>
+          <w:szCs w:val="24"/>
+        </w:rPr>
+      </w:pPr>
+    </w:p>
+    <w:p>
+      <w:pPr>
+        <w:pBdr>
+          <w:top w:val="nil"/>
+          <w:left w:val="nil"/>
+          <w:bottom w:val="nil"/>
+          <w:right w:val="nil"/>
+          <w:between w:val="nil"/>
+        </w:pBdr>
+        <w:jc w:val="both"/>
+        <w:rPr>
+          <w:b/>
+          <w:sz w:val="28"/>
+          <w:szCs w:val="28"/>
+        </w:rPr>
+      </w:pPr>
+      <w:r>
+        <w:rPr>
+          <w:b/>
+          <w:sz w:val="28"/>
+          <w:szCs w:val="28"/>
+        </w:rPr>
+        <w:t>3.3.</w:t>
+      </w:r>
+      <w:r>
+        <w:rPr>
+          <w:b/>
+          <w:sz w:val="28"/>
+          <w:szCs w:val="28"/>
+        </w:rPr>
+        <w:t>4</w:t>
+      </w:r>
+      <w:r>
+        <w:rPr>
+          <w:b/>
+          <w:sz w:val="28"/>
+          <w:szCs w:val="28"/>
+        </w:rPr>
+        <w:t xml:space="preserve">.- </w:t>
+      </w:r>
+      <w:r>
+        <w:rPr>
+          <w:b/>
+          <w:sz w:val="28"/>
+          <w:szCs w:val="28"/>
+        </w:rPr>
+        <w:t>Axios</w:t>
+      </w:r>
+    </w:p>
+    <w:p>
+      <w:pPr>
+        <w:pBdr>
+          <w:top w:val="nil"/>
+          <w:left w:val="nil"/>
+          <w:bottom w:val="nil"/>
+          <w:right w:val="nil"/>
+          <w:between w:val="nil"/>
+        </w:pBdr>
+        <w:jc w:val="both"/>
+        <w:rPr>
+          <w:rFonts w:ascii="Times New Roman" w:eastAsia="Times New Roman" w:hAnsi="Times New Roman" w:cs="Times New Roman"/>
+          <w:sz w:val="24"/>
+          <w:szCs w:val="24"/>
+        </w:rPr>
+      </w:pPr>
+    </w:p>
+    <w:p>
+      <w:pPr>
+        <w:pBdr>
+          <w:top w:val="nil"/>
+          <w:left w:val="nil"/>
+          <w:bottom w:val="nil"/>
+          <w:right w:val="nil"/>
+          <w:between w:val="nil"/>
+        </w:pBdr>
+        <w:jc w:val="both"/>
+        <w:rPr>
+          <w:rFonts w:ascii="Times New Roman" w:eastAsia="Times New Roman" w:hAnsi="Times New Roman" w:cs="Times New Roman"/>
+          <w:sz w:val="24"/>
+          <w:szCs w:val="24"/>
+        </w:rPr>
+      </w:pPr>
+      <w:r>
+        <w:rPr>
+          <w:rFonts w:ascii="Times New Roman" w:eastAsia="Times New Roman" w:hAnsi="Times New Roman" w:cs="Times New Roman"/>
+          <w:sz w:val="24"/>
+          <w:szCs w:val="24"/>
+        </w:rPr>
+        <w:t>Axios es una librería JavaScript para la realización de peticiones HTTP desde el navegador y desde Node.js. Proporciona una interfaz basada en promesas que simplifica el manejo de peticiones asíncronas y ofrece funcionalidades adicionales respecto a la API Fetch nativa del navegador, como la transformación automática de respuestas JSON, la gestión centralizada de errores mediante interceptores y la posibilidad de configurar cabeceras globales para todas las peticiones.</w:t>
+      </w:r>
+    </w:p>
+    <w:p>
+      <w:pPr>
+        <w:pBdr>
+          <w:top w:val="nil"/>
+          <w:left w:val="nil"/>
+          <w:bottom w:val="nil"/>
+          <w:right w:val="nil"/>
+          <w:between w:val="nil"/>
+        </w:pBdr>
+        <w:jc w:val="both"/>
+        <w:rPr>
+          <w:rFonts w:ascii="Times New Roman" w:eastAsia="Times New Roman" w:hAnsi="Times New Roman" w:cs="Times New Roman"/>
+          <w:sz w:val="24"/>
+          <w:szCs w:val="24"/>
+        </w:rPr>
+      </w:pPr>
+    </w:p>
+    <w:p>
+      <w:pPr>
+        <w:pBdr>
+          <w:top w:val="nil"/>
+          <w:left w:val="nil"/>
+          <w:bottom w:val="nil"/>
+          <w:right w:val="nil"/>
+          <w:between w:val="nil"/>
+        </w:pBdr>
+        <w:jc w:val="both"/>
+        <w:rPr>
+          <w:rFonts w:ascii="Times New Roman" w:eastAsia="Times New Roman" w:hAnsi="Times New Roman" w:cs="Times New Roman"/>
+          <w:sz w:val="24"/>
+          <w:szCs w:val="24"/>
+        </w:rPr>
+      </w:pPr>
+      <w:r>
+        <w:rPr>
+          <w:rFonts w:ascii="Times New Roman" w:eastAsia="Times New Roman" w:hAnsi="Times New Roman" w:cs="Times New Roman"/>
+          <w:sz w:val="24"/>
+          <w:szCs w:val="24"/>
+        </w:rPr>
+        <w:t xml:space="preserve">La alternativa principal considerada fue la API Fetch nativa del navegador, que no requiere instalación adicional. Axios fue preferido por su mayor ergonomía, especialmente para la gestión de errores y la configuración centralizada de las cabeceras de autenticación. En </w:t>
+      </w:r>
+      <w:r>
+        <w:rPr>
+          <w:rFonts w:ascii="Times New Roman" w:eastAsia="Times New Roman" w:hAnsi="Times New Roman" w:cs="Times New Roman"/>
+          <w:sz w:val="24"/>
+          <w:szCs w:val="24"/>
+        </w:rPr>
+        <w:t>CarePet</w:t>
+      </w:r>
+      <w:r>
+        <w:rPr>
+          <w:rFonts w:ascii="Times New Roman" w:eastAsia="Times New Roman" w:hAnsi="Times New Roman" w:cs="Times New Roman"/>
+          <w:sz w:val="24"/>
+          <w:szCs w:val="24"/>
+        </w:rPr>
+        <w:t>, Axios se utiliza para todas las llamadas a la API REST del backend, configurando mediante interceptores la inclusión automática del token JWT en la cabecera de autorización de cada petición.</w:t>
+      </w:r>
+    </w:p>
+    <w:p>
+      <w:pPr>
+        <w:pBdr>
+          <w:top w:val="nil"/>
+          <w:left w:val="nil"/>
+          <w:bottom w:val="nil"/>
+          <w:right w:val="nil"/>
+          <w:between w:val="nil"/>
+        </w:pBdr>
+        <w:jc w:val="both"/>
+        <w:rPr>
+          <w:rFonts w:ascii="Times New Roman" w:eastAsia="Times New Roman" w:hAnsi="Times New Roman" w:cs="Times New Roman"/>
+          <w:sz w:val="24"/>
+          <w:szCs w:val="24"/>
+        </w:rPr>
+      </w:pPr>
+    </w:p>
+    <w:p>
+      <w:pPr>
+        <w:pBdr>
+          <w:top w:val="nil"/>
+          <w:left w:val="nil"/>
+          <w:bottom w:val="nil"/>
+          <w:right w:val="nil"/>
+          <w:between w:val="nil"/>
+        </w:pBdr>
+        <w:jc w:val="both"/>
+        <w:rPr>
+          <w:rFonts w:ascii="Times New Roman" w:eastAsia="Times New Roman" w:hAnsi="Times New Roman" w:cs="Times New Roman"/>
+          <w:sz w:val="24"/>
+          <w:szCs w:val="24"/>
+        </w:rPr>
+      </w:pPr>
+    </w:p>
+    <w:p>
+      <w:pPr>
+        <w:pBdr>
+          <w:top w:val="nil"/>
+          <w:left w:val="nil"/>
+          <w:bottom w:val="nil"/>
+          <w:right w:val="nil"/>
+          <w:between w:val="nil"/>
+        </w:pBdr>
         <w:rPr>
           <w:b/>
           <w:sz w:val="36"/>
           <w:szCs w:val="36"/>
         </w:rPr>
-        <w:t>3</w:t>
-      </w:r>
+      </w:pPr>
       <w:r>
         <w:rPr>
           <w:b/>
           <w:sz w:val="36"/>
           <w:szCs w:val="36"/>
         </w:rPr>
-        <w:t xml:space="preserve">.- Tecnologías del </w:t>
+        <w:t>3.</w:t>
       </w:r>
       <w:r>
         <w:rPr>
@@ -3373,7 +4576,7 @@
           <w:sz w:val="36"/>
           <w:szCs w:val="36"/>
         </w:rPr>
-        <w:t>front</w:t>
+        <w:t>4</w:t>
       </w:r>
       <w:r>
         <w:rPr>
@@ -3381,49 +4584,73 @@
           <w:sz w:val="36"/>
           <w:szCs w:val="36"/>
         </w:rPr>
-        <w:t>end</w:t>
-      </w:r>
-    </w:p>
-    <w:p>
-      <w:pPr>
-        <w:pBdr>
-          <w:top w:val="nil"/>
-          <w:left w:val="nil"/>
-          <w:bottom w:val="nil"/>
-          <w:right w:val="nil"/>
-          <w:between w:val="nil"/>
-        </w:pBdr>
-        <w:jc w:val="both"/>
-        <w:rPr>
-          <w:rFonts w:ascii="Times New Roman" w:eastAsia="Times New Roman" w:hAnsi="Times New Roman" w:cs="Times New Roman"/>
-          <w:sz w:val="24"/>
-          <w:szCs w:val="24"/>
-        </w:rPr>
-      </w:pPr>
-    </w:p>
-    <w:p>
-      <w:pPr>
-        <w:pBdr>
-          <w:top w:val="nil"/>
-          <w:left w:val="nil"/>
-          <w:bottom w:val="nil"/>
-          <w:right w:val="nil"/>
-          <w:between w:val="nil"/>
-        </w:pBdr>
-        <w:jc w:val="both"/>
-        <w:rPr>
-          <w:rFonts w:ascii="Times New Roman" w:eastAsia="Times New Roman" w:hAnsi="Times New Roman" w:cs="Times New Roman"/>
-          <w:sz w:val="24"/>
-          <w:szCs w:val="24"/>
-        </w:rPr>
-      </w:pPr>
-      <w:r>
-        <w:rPr>
-          <w:rFonts w:ascii="Times New Roman" w:eastAsia="Times New Roman" w:hAnsi="Times New Roman" w:cs="Times New Roman"/>
-          <w:sz w:val="24"/>
-          <w:szCs w:val="24"/>
-        </w:rPr>
-        <w:t>…</w:t>
+        <w:t xml:space="preserve">.- </w:t>
+      </w:r>
+      <w:r>
+        <w:rPr>
+          <w:b/>
+          <w:sz w:val="36"/>
+          <w:szCs w:val="36"/>
+        </w:rPr>
+        <w:t>Herramientas de desarrollo</w:t>
+      </w:r>
+    </w:p>
+    <w:p>
+      <w:pPr>
+        <w:pBdr>
+          <w:top w:val="nil"/>
+          <w:left w:val="nil"/>
+          <w:bottom w:val="nil"/>
+          <w:right w:val="nil"/>
+          <w:between w:val="nil"/>
+        </w:pBdr>
+        <w:jc w:val="both"/>
+        <w:rPr>
+          <w:rFonts w:ascii="Times New Roman" w:eastAsia="Times New Roman" w:hAnsi="Times New Roman" w:cs="Times New Roman"/>
+          <w:sz w:val="24"/>
+          <w:szCs w:val="24"/>
+        </w:rPr>
+      </w:pPr>
+    </w:p>
+    <w:p>
+      <w:pPr>
+        <w:pBdr>
+          <w:top w:val="nil"/>
+          <w:left w:val="nil"/>
+          <w:bottom w:val="nil"/>
+          <w:right w:val="nil"/>
+          <w:between w:val="nil"/>
+        </w:pBdr>
+        <w:jc w:val="both"/>
+        <w:rPr>
+          <w:rFonts w:ascii="Times New Roman" w:eastAsia="Times New Roman" w:hAnsi="Times New Roman" w:cs="Times New Roman"/>
+          <w:sz w:val="24"/>
+          <w:szCs w:val="24"/>
+        </w:rPr>
+      </w:pPr>
+      <w:r>
+        <w:rPr>
+          <w:rFonts w:ascii="Times New Roman" w:eastAsia="Times New Roman" w:hAnsi="Times New Roman" w:cs="Times New Roman"/>
+          <w:sz w:val="24"/>
+          <w:szCs w:val="24"/>
+        </w:rPr>
+        <w:t xml:space="preserve">Además de las tecnologías que forman parte del producto final, el desarrollo de </w:t>
+      </w:r>
+      <w:r>
+        <w:rPr>
+          <w:rFonts w:ascii="Times New Roman" w:eastAsia="Times New Roman" w:hAnsi="Times New Roman" w:cs="Times New Roman"/>
+          <w:sz w:val="24"/>
+          <w:szCs w:val="24"/>
+        </w:rPr>
+        <w:t>CarePet</w:t>
+      </w:r>
+      <w:r>
+        <w:rPr>
+          <w:rFonts w:ascii="Times New Roman" w:eastAsia="Times New Roman" w:hAnsi="Times New Roman" w:cs="Times New Roman"/>
+          <w:sz w:val="24"/>
+          <w:szCs w:val="24"/>
+        </w:rPr>
+        <w:t xml:space="preserve"> se apoya en un conjunto de herramientas que facilitan la escritura del código, el control de cambios, la gestión de dependencias y las pruebas de la API.</w:t>
       </w:r>
     </w:p>
     <w:p>
@@ -3490,6 +4717,510 @@
           <w:sz w:val="28"/>
           <w:szCs w:val="28"/>
         </w:rPr>
+        <w:t>4</w:t>
+      </w:r>
+      <w:r>
+        <w:rPr>
+          <w:b/>
+          <w:sz w:val="28"/>
+          <w:szCs w:val="28"/>
+        </w:rPr>
+        <w:t>.</w:t>
+      </w:r>
+      <w:r>
+        <w:rPr>
+          <w:b/>
+          <w:sz w:val="28"/>
+          <w:szCs w:val="28"/>
+        </w:rPr>
+        <w:t>1</w:t>
+      </w:r>
+      <w:r>
+        <w:rPr>
+          <w:b/>
+          <w:sz w:val="28"/>
+          <w:szCs w:val="28"/>
+        </w:rPr>
+        <w:t xml:space="preserve">.- </w:t>
+      </w:r>
+      <w:r>
+        <w:rPr>
+          <w:b/>
+          <w:sz w:val="28"/>
+          <w:szCs w:val="28"/>
+        </w:rPr>
+        <w:t>IntelliJ IDEA</w:t>
+      </w:r>
+    </w:p>
+    <w:p>
+      <w:pPr>
+        <w:pBdr>
+          <w:top w:val="nil"/>
+          <w:left w:val="nil"/>
+          <w:bottom w:val="nil"/>
+          <w:right w:val="nil"/>
+          <w:between w:val="nil"/>
+        </w:pBdr>
+        <w:jc w:val="both"/>
+        <w:rPr>
+          <w:rFonts w:ascii="Times New Roman" w:eastAsia="Times New Roman" w:hAnsi="Times New Roman" w:cs="Times New Roman"/>
+          <w:sz w:val="24"/>
+          <w:szCs w:val="24"/>
+        </w:rPr>
+      </w:pPr>
+    </w:p>
+    <w:p>
+      <w:pPr>
+        <w:pBdr>
+          <w:top w:val="nil"/>
+          <w:left w:val="nil"/>
+          <w:bottom w:val="nil"/>
+          <w:right w:val="nil"/>
+          <w:between w:val="nil"/>
+        </w:pBdr>
+        <w:jc w:val="both"/>
+        <w:rPr>
+          <w:rFonts w:ascii="Times New Roman" w:eastAsia="Times New Roman" w:hAnsi="Times New Roman" w:cs="Times New Roman"/>
+          <w:sz w:val="24"/>
+          <w:szCs w:val="24"/>
+        </w:rPr>
+      </w:pPr>
+      <w:r>
+        <w:rPr>
+          <w:rFonts w:ascii="Times New Roman" w:eastAsia="Times New Roman" w:hAnsi="Times New Roman" w:cs="Times New Roman"/>
+          <w:sz w:val="24"/>
+          <w:szCs w:val="24"/>
+        </w:rPr>
+        <w:t xml:space="preserve">Para el desarrollo tanto del backend como del frontend se utiliza IntelliJ IDEA </w:t>
+      </w:r>
+      <w:proofErr w:type="spellStart"/>
+      <w:r>
+        <w:rPr>
+          <w:rFonts w:ascii="Times New Roman" w:eastAsia="Times New Roman" w:hAnsi="Times New Roman" w:cs="Times New Roman"/>
+          <w:sz w:val="24"/>
+          <w:szCs w:val="24"/>
+        </w:rPr>
+        <w:t>Community</w:t>
+      </w:r>
+      <w:proofErr w:type="spellEnd"/>
+      <w:r>
+        <w:rPr>
+          <w:rFonts w:ascii="Times New Roman" w:eastAsia="Times New Roman" w:hAnsi="Times New Roman" w:cs="Times New Roman"/>
+          <w:sz w:val="24"/>
+          <w:szCs w:val="24"/>
+        </w:rPr>
+        <w:t xml:space="preserve"> </w:t>
+      </w:r>
+      <w:proofErr w:type="spellStart"/>
+      <w:r>
+        <w:rPr>
+          <w:rFonts w:ascii="Times New Roman" w:eastAsia="Times New Roman" w:hAnsi="Times New Roman" w:cs="Times New Roman"/>
+          <w:sz w:val="24"/>
+          <w:szCs w:val="24"/>
+        </w:rPr>
+        <w:t>Edition</w:t>
+      </w:r>
+      <w:proofErr w:type="spellEnd"/>
+      <w:r>
+        <w:rPr>
+          <w:rFonts w:ascii="Times New Roman" w:eastAsia="Times New Roman" w:hAnsi="Times New Roman" w:cs="Times New Roman"/>
+          <w:sz w:val="24"/>
+          <w:szCs w:val="24"/>
+        </w:rPr>
+        <w:t xml:space="preserve">, el entorno de desarrollo integrado (IDE) de </w:t>
+      </w:r>
+      <w:proofErr w:type="spellStart"/>
+      <w:r>
+        <w:rPr>
+          <w:rFonts w:ascii="Times New Roman" w:eastAsia="Times New Roman" w:hAnsi="Times New Roman" w:cs="Times New Roman"/>
+          <w:sz w:val="24"/>
+          <w:szCs w:val="24"/>
+        </w:rPr>
+        <w:t>JetBrains</w:t>
+      </w:r>
+      <w:proofErr w:type="spellEnd"/>
+      <w:r>
+        <w:rPr>
+          <w:rFonts w:ascii="Times New Roman" w:eastAsia="Times New Roman" w:hAnsi="Times New Roman" w:cs="Times New Roman"/>
+          <w:sz w:val="24"/>
+          <w:szCs w:val="24"/>
+        </w:rPr>
+        <w:t xml:space="preserve"> especializado en Java y el ecosistema Spring. Aunque IntelliJ IDEA es especialmente conocido por su soporte para Java, también ofrece un soporte robusto para el desarrollo frontend con JavaScript y React, incluyendo autocompletado, análisis estático del código, integración con herramientas de formateo como </w:t>
+      </w:r>
+      <w:proofErr w:type="spellStart"/>
+      <w:r>
+        <w:rPr>
+          <w:rFonts w:ascii="Times New Roman" w:eastAsia="Times New Roman" w:hAnsi="Times New Roman" w:cs="Times New Roman"/>
+          <w:sz w:val="24"/>
+          <w:szCs w:val="24"/>
+        </w:rPr>
+        <w:t>Prettier</w:t>
+      </w:r>
+      <w:proofErr w:type="spellEnd"/>
+      <w:r>
+        <w:rPr>
+          <w:rFonts w:ascii="Times New Roman" w:eastAsia="Times New Roman" w:hAnsi="Times New Roman" w:cs="Times New Roman"/>
+          <w:sz w:val="24"/>
+          <w:szCs w:val="24"/>
+        </w:rPr>
+        <w:t xml:space="preserve"> y soporte nativo para </w:t>
+      </w:r>
+      <w:proofErr w:type="spellStart"/>
+      <w:r>
+        <w:rPr>
+          <w:rFonts w:ascii="Times New Roman" w:eastAsia="Times New Roman" w:hAnsi="Times New Roman" w:cs="Times New Roman"/>
+          <w:sz w:val="24"/>
+          <w:szCs w:val="24"/>
+        </w:rPr>
+        <w:t>npm</w:t>
+      </w:r>
+      <w:proofErr w:type="spellEnd"/>
+      <w:r>
+        <w:rPr>
+          <w:rFonts w:ascii="Times New Roman" w:eastAsia="Times New Roman" w:hAnsi="Times New Roman" w:cs="Times New Roman"/>
+          <w:sz w:val="24"/>
+          <w:szCs w:val="24"/>
+        </w:rPr>
+        <w:t xml:space="preserve"> y Vite. Esta decisión de utilizar un único IDE para ambas capas simplifica el entorno de trabajo y evita la necesidad de alternar entre herramientas distintas durante el desarrollo. IntelliJ IDEA ofrece además un depurador integrado, soporte nativo para Maven y herramientas de refactorización avanzadas que facilitan el mantenimiento del código en ambas capas del proyecto.</w:t>
+      </w:r>
+    </w:p>
+    <w:p>
+      <w:pPr>
+        <w:pBdr>
+          <w:top w:val="nil"/>
+          <w:left w:val="nil"/>
+          <w:bottom w:val="nil"/>
+          <w:right w:val="nil"/>
+          <w:between w:val="nil"/>
+        </w:pBdr>
+        <w:jc w:val="both"/>
+        <w:rPr>
+          <w:rFonts w:ascii="Times New Roman" w:eastAsia="Times New Roman" w:hAnsi="Times New Roman" w:cs="Times New Roman"/>
+          <w:sz w:val="24"/>
+          <w:szCs w:val="24"/>
+        </w:rPr>
+      </w:pPr>
+    </w:p>
+    <w:p>
+      <w:pPr>
+        <w:pBdr>
+          <w:top w:val="nil"/>
+          <w:left w:val="nil"/>
+          <w:bottom w:val="nil"/>
+          <w:right w:val="nil"/>
+          <w:between w:val="nil"/>
+        </w:pBdr>
+        <w:jc w:val="both"/>
+        <w:rPr>
+          <w:rFonts w:ascii="Times New Roman" w:eastAsia="Times New Roman" w:hAnsi="Times New Roman" w:cs="Times New Roman"/>
+          <w:sz w:val="24"/>
+          <w:szCs w:val="24"/>
+        </w:rPr>
+      </w:pPr>
+    </w:p>
+    <w:p>
+      <w:pPr>
+        <w:pBdr>
+          <w:top w:val="nil"/>
+          <w:left w:val="nil"/>
+          <w:bottom w:val="nil"/>
+          <w:right w:val="nil"/>
+          <w:between w:val="nil"/>
+        </w:pBdr>
+        <w:jc w:val="both"/>
+        <w:rPr>
+          <w:b/>
+          <w:sz w:val="28"/>
+          <w:szCs w:val="28"/>
+        </w:rPr>
+      </w:pPr>
+      <w:r>
+        <w:rPr>
+          <w:b/>
+          <w:sz w:val="28"/>
+          <w:szCs w:val="28"/>
+        </w:rPr>
+        <w:t>3.4.</w:t>
+      </w:r>
+      <w:r>
+        <w:rPr>
+          <w:b/>
+          <w:sz w:val="28"/>
+          <w:szCs w:val="28"/>
+        </w:rPr>
+        <w:t>2</w:t>
+      </w:r>
+      <w:r>
+        <w:rPr>
+          <w:b/>
+          <w:sz w:val="28"/>
+          <w:szCs w:val="28"/>
+        </w:rPr>
+        <w:t xml:space="preserve">.- </w:t>
+      </w:r>
+      <w:r>
+        <w:rPr>
+          <w:b/>
+          <w:sz w:val="28"/>
+          <w:szCs w:val="28"/>
+        </w:rPr>
+        <w:t>Git y GitHub</w:t>
+      </w:r>
+    </w:p>
+    <w:p>
+      <w:pPr>
+        <w:pBdr>
+          <w:top w:val="nil"/>
+          <w:left w:val="nil"/>
+          <w:bottom w:val="nil"/>
+          <w:right w:val="nil"/>
+          <w:between w:val="nil"/>
+        </w:pBdr>
+        <w:jc w:val="both"/>
+        <w:rPr>
+          <w:rFonts w:ascii="Times New Roman" w:eastAsia="Times New Roman" w:hAnsi="Times New Roman" w:cs="Times New Roman"/>
+          <w:sz w:val="24"/>
+          <w:szCs w:val="24"/>
+        </w:rPr>
+      </w:pPr>
+    </w:p>
+    <w:p>
+      <w:pPr>
+        <w:pBdr>
+          <w:top w:val="nil"/>
+          <w:left w:val="nil"/>
+          <w:bottom w:val="nil"/>
+          <w:right w:val="nil"/>
+          <w:between w:val="nil"/>
+        </w:pBdr>
+        <w:jc w:val="both"/>
+        <w:rPr>
+          <w:rFonts w:ascii="Times New Roman" w:eastAsia="Times New Roman" w:hAnsi="Times New Roman" w:cs="Times New Roman"/>
+          <w:sz w:val="24"/>
+          <w:szCs w:val="24"/>
+        </w:rPr>
+      </w:pPr>
+      <w:r>
+        <w:rPr>
+          <w:rFonts w:ascii="Times New Roman" w:eastAsia="Times New Roman" w:hAnsi="Times New Roman" w:cs="Times New Roman"/>
+          <w:sz w:val="24"/>
+          <w:szCs w:val="24"/>
+        </w:rPr>
+        <w:t xml:space="preserve">Git es el sistema de control de versiones distribuido más utilizado en el desarrollo de software. Permite registrar el historial completo de cambios del proyecto, trabajar en ramas independientes para el desarrollo de nuevas funcionalidades y revertir el código a cualquier estado anterior en caso de error. En </w:t>
+      </w:r>
+      <w:r>
+        <w:rPr>
+          <w:rFonts w:ascii="Times New Roman" w:eastAsia="Times New Roman" w:hAnsi="Times New Roman" w:cs="Times New Roman"/>
+          <w:sz w:val="24"/>
+          <w:szCs w:val="24"/>
+        </w:rPr>
+        <w:t>CarePet</w:t>
+      </w:r>
+      <w:r>
+        <w:rPr>
+          <w:rFonts w:ascii="Times New Roman" w:eastAsia="Times New Roman" w:hAnsi="Times New Roman" w:cs="Times New Roman"/>
+          <w:sz w:val="24"/>
+          <w:szCs w:val="24"/>
+        </w:rPr>
+        <w:t xml:space="preserve"> se utiliza una estrategia de ramas basada en tres niveles: </w:t>
+      </w:r>
+      <w:proofErr w:type="spellStart"/>
+      <w:r>
+        <w:rPr>
+          <w:rFonts w:ascii="Times New Roman" w:eastAsia="Times New Roman" w:hAnsi="Times New Roman" w:cs="Times New Roman"/>
+          <w:sz w:val="24"/>
+          <w:szCs w:val="24"/>
+        </w:rPr>
+        <w:t>main</w:t>
+      </w:r>
+      <w:proofErr w:type="spellEnd"/>
+      <w:r>
+        <w:rPr>
+          <w:rFonts w:ascii="Times New Roman" w:eastAsia="Times New Roman" w:hAnsi="Times New Roman" w:cs="Times New Roman"/>
+          <w:sz w:val="24"/>
+          <w:szCs w:val="24"/>
+        </w:rPr>
+        <w:t xml:space="preserve"> para el código en producción, </w:t>
+      </w:r>
+      <w:proofErr w:type="spellStart"/>
+      <w:r>
+        <w:rPr>
+          <w:rFonts w:ascii="Times New Roman" w:eastAsia="Times New Roman" w:hAnsi="Times New Roman" w:cs="Times New Roman"/>
+          <w:sz w:val="24"/>
+          <w:szCs w:val="24"/>
+        </w:rPr>
+        <w:t>develop</w:t>
+      </w:r>
+      <w:proofErr w:type="spellEnd"/>
+      <w:r>
+        <w:rPr>
+          <w:rFonts w:ascii="Times New Roman" w:eastAsia="Times New Roman" w:hAnsi="Times New Roman" w:cs="Times New Roman"/>
+          <w:sz w:val="24"/>
+          <w:szCs w:val="24"/>
+        </w:rPr>
+        <w:t xml:space="preserve"> para la integración de funcionalidades completadas y </w:t>
+      </w:r>
+      <w:proofErr w:type="spellStart"/>
+      <w:r>
+        <w:rPr>
+          <w:rFonts w:ascii="Times New Roman" w:eastAsia="Times New Roman" w:hAnsi="Times New Roman" w:cs="Times New Roman"/>
+          <w:sz w:val="24"/>
+          <w:szCs w:val="24"/>
+        </w:rPr>
+        <w:t>feature</w:t>
+      </w:r>
+      <w:proofErr w:type="spellEnd"/>
+      <w:r>
+        <w:rPr>
+          <w:rFonts w:ascii="Times New Roman" w:eastAsia="Times New Roman" w:hAnsi="Times New Roman" w:cs="Times New Roman"/>
+          <w:sz w:val="24"/>
+          <w:szCs w:val="24"/>
+        </w:rPr>
+        <w:t>/* para el desarrollo de cada nueva funcionalidad de forma aislada.</w:t>
+      </w:r>
+    </w:p>
+    <w:p>
+      <w:pPr>
+        <w:pBdr>
+          <w:top w:val="nil"/>
+          <w:left w:val="nil"/>
+          <w:bottom w:val="nil"/>
+          <w:right w:val="nil"/>
+          <w:between w:val="nil"/>
+        </w:pBdr>
+        <w:jc w:val="both"/>
+        <w:rPr>
+          <w:rFonts w:ascii="Times New Roman" w:eastAsia="Times New Roman" w:hAnsi="Times New Roman" w:cs="Times New Roman"/>
+          <w:sz w:val="24"/>
+          <w:szCs w:val="24"/>
+        </w:rPr>
+      </w:pPr>
+    </w:p>
+    <w:p>
+      <w:pPr>
+        <w:pBdr>
+          <w:top w:val="nil"/>
+          <w:left w:val="nil"/>
+          <w:bottom w:val="nil"/>
+          <w:right w:val="nil"/>
+          <w:between w:val="nil"/>
+        </w:pBdr>
+        <w:jc w:val="both"/>
+        <w:rPr>
+          <w:rFonts w:ascii="Times New Roman" w:eastAsia="Times New Roman" w:hAnsi="Times New Roman" w:cs="Times New Roman"/>
+          <w:sz w:val="24"/>
+          <w:szCs w:val="24"/>
+        </w:rPr>
+      </w:pPr>
+      <w:r>
+        <w:rPr>
+          <w:rFonts w:ascii="Times New Roman" w:eastAsia="Times New Roman" w:hAnsi="Times New Roman" w:cs="Times New Roman"/>
+          <w:sz w:val="24"/>
+          <w:szCs w:val="24"/>
+        </w:rPr>
+        <w:t xml:space="preserve">GitHub es la plataforma de alojamiento de repositorios Git más extendida. En este proyecto actúa como repositorio remoto centralizado del código fuente y como punto de integración con las plataformas de despliegue. </w:t>
+      </w:r>
+      <w:proofErr w:type="spellStart"/>
+      <w:r>
+        <w:rPr>
+          <w:rFonts w:ascii="Times New Roman" w:eastAsia="Times New Roman" w:hAnsi="Times New Roman" w:cs="Times New Roman"/>
+          <w:sz w:val="24"/>
+          <w:szCs w:val="24"/>
+        </w:rPr>
+        <w:t>Vercel</w:t>
+      </w:r>
+      <w:proofErr w:type="spellEnd"/>
+      <w:r>
+        <w:rPr>
+          <w:rFonts w:ascii="Times New Roman" w:eastAsia="Times New Roman" w:hAnsi="Times New Roman" w:cs="Times New Roman"/>
+          <w:sz w:val="24"/>
+          <w:szCs w:val="24"/>
+        </w:rPr>
+        <w:t xml:space="preserve"> y </w:t>
+      </w:r>
+      <w:proofErr w:type="spellStart"/>
+      <w:r>
+        <w:rPr>
+          <w:rFonts w:ascii="Times New Roman" w:eastAsia="Times New Roman" w:hAnsi="Times New Roman" w:cs="Times New Roman"/>
+          <w:sz w:val="24"/>
+          <w:szCs w:val="24"/>
+        </w:rPr>
+        <w:t>Railway</w:t>
+      </w:r>
+      <w:proofErr w:type="spellEnd"/>
+      <w:r>
+        <w:rPr>
+          <w:rFonts w:ascii="Times New Roman" w:eastAsia="Times New Roman" w:hAnsi="Times New Roman" w:cs="Times New Roman"/>
+          <w:sz w:val="24"/>
+          <w:szCs w:val="24"/>
+        </w:rPr>
+        <w:t xml:space="preserve"> están configurados para detectar automáticamente los cambios en las ramas correspondientes del repositorio y ejecutar el despliegue de forma automática, lo que establece un flujo de integración y despliegue continuo (CI/CD) sin necesidad de configuración adicional.</w:t>
+      </w:r>
+    </w:p>
+    <w:p>
+      <w:pPr>
+        <w:pBdr>
+          <w:top w:val="nil"/>
+          <w:left w:val="nil"/>
+          <w:bottom w:val="nil"/>
+          <w:right w:val="nil"/>
+          <w:between w:val="nil"/>
+        </w:pBdr>
+        <w:jc w:val="both"/>
+        <w:rPr>
+          <w:rFonts w:ascii="Times New Roman" w:eastAsia="Times New Roman" w:hAnsi="Times New Roman" w:cs="Times New Roman"/>
+          <w:sz w:val="24"/>
+          <w:szCs w:val="24"/>
+        </w:rPr>
+      </w:pPr>
+    </w:p>
+    <w:p>
+      <w:pPr>
+        <w:pBdr>
+          <w:top w:val="nil"/>
+          <w:left w:val="nil"/>
+          <w:bottom w:val="nil"/>
+          <w:right w:val="nil"/>
+          <w:between w:val="nil"/>
+        </w:pBdr>
+        <w:jc w:val="both"/>
+        <w:rPr>
+          <w:rFonts w:ascii="Times New Roman" w:eastAsia="Times New Roman" w:hAnsi="Times New Roman" w:cs="Times New Roman"/>
+          <w:sz w:val="24"/>
+          <w:szCs w:val="24"/>
+        </w:rPr>
+      </w:pPr>
+    </w:p>
+    <w:p>
+      <w:pPr>
+        <w:pBdr>
+          <w:top w:val="nil"/>
+          <w:left w:val="nil"/>
+          <w:bottom w:val="nil"/>
+          <w:right w:val="nil"/>
+          <w:between w:val="nil"/>
+        </w:pBdr>
+        <w:jc w:val="both"/>
+        <w:rPr>
+          <w:b/>
+          <w:sz w:val="28"/>
+          <w:szCs w:val="28"/>
+        </w:rPr>
+      </w:pPr>
+      <w:r>
+        <w:rPr>
+          <w:b/>
+          <w:sz w:val="28"/>
+          <w:szCs w:val="28"/>
+        </w:rPr>
+        <w:t>3.4.</w:t>
+      </w:r>
+      <w:r>
+        <w:rPr>
+          <w:b/>
+          <w:sz w:val="28"/>
+          <w:szCs w:val="28"/>
+        </w:rPr>
         <w:t>3</w:t>
       </w:r>
       <w:r>
@@ -3498,57 +5229,1174 @@
           <w:sz w:val="28"/>
           <w:szCs w:val="28"/>
         </w:rPr>
-        <w:t xml:space="preserve">.1.- </w:t>
-      </w:r>
-      <w:r>
-        <w:rPr>
-          <w:b/>
-          <w:sz w:val="28"/>
-          <w:szCs w:val="28"/>
-        </w:rPr>
-        <w:t>…</w:t>
-      </w:r>
-    </w:p>
-    <w:p>
-      <w:pPr>
-        <w:pBdr>
-          <w:top w:val="nil"/>
-          <w:left w:val="nil"/>
-          <w:bottom w:val="nil"/>
-          <w:right w:val="nil"/>
-          <w:between w:val="nil"/>
-        </w:pBdr>
-        <w:jc w:val="both"/>
-        <w:rPr>
-          <w:rFonts w:ascii="Times New Roman" w:eastAsia="Times New Roman" w:hAnsi="Times New Roman" w:cs="Times New Roman"/>
-          <w:sz w:val="24"/>
-          <w:szCs w:val="24"/>
-        </w:rPr>
-      </w:pPr>
-    </w:p>
-    <w:p>
-      <w:pPr>
-        <w:pBdr>
-          <w:top w:val="nil"/>
-          <w:left w:val="nil"/>
-          <w:bottom w:val="nil"/>
-          <w:right w:val="nil"/>
-          <w:between w:val="nil"/>
-        </w:pBdr>
-        <w:jc w:val="both"/>
-        <w:rPr>
-          <w:rFonts w:ascii="Times New Roman" w:eastAsia="Times New Roman" w:hAnsi="Times New Roman" w:cs="Times New Roman"/>
-          <w:sz w:val="24"/>
-          <w:szCs w:val="24"/>
-        </w:rPr>
-      </w:pPr>
-      <w:r>
-        <w:rPr>
-          <w:rFonts w:ascii="Times New Roman" w:eastAsia="Times New Roman" w:hAnsi="Times New Roman" w:cs="Times New Roman"/>
-          <w:sz w:val="24"/>
-          <w:szCs w:val="24"/>
-        </w:rPr>
-        <w:t>…</w:t>
+        <w:t xml:space="preserve">.- </w:t>
+      </w:r>
+      <w:r>
+        <w:rPr>
+          <w:b/>
+          <w:sz w:val="28"/>
+          <w:szCs w:val="28"/>
+        </w:rPr>
+        <w:t xml:space="preserve">Maven y </w:t>
+      </w:r>
+      <w:proofErr w:type="spellStart"/>
+      <w:r>
+        <w:rPr>
+          <w:b/>
+          <w:sz w:val="28"/>
+          <w:szCs w:val="28"/>
+        </w:rPr>
+        <w:t>npm</w:t>
+      </w:r>
+      <w:proofErr w:type="spellEnd"/>
+    </w:p>
+    <w:p>
+      <w:pPr>
+        <w:pBdr>
+          <w:top w:val="nil"/>
+          <w:left w:val="nil"/>
+          <w:bottom w:val="nil"/>
+          <w:right w:val="nil"/>
+          <w:between w:val="nil"/>
+        </w:pBdr>
+        <w:jc w:val="both"/>
+        <w:rPr>
+          <w:rFonts w:ascii="Times New Roman" w:eastAsia="Times New Roman" w:hAnsi="Times New Roman" w:cs="Times New Roman"/>
+          <w:sz w:val="24"/>
+          <w:szCs w:val="24"/>
+        </w:rPr>
+      </w:pPr>
+    </w:p>
+    <w:p>
+      <w:pPr>
+        <w:pBdr>
+          <w:top w:val="nil"/>
+          <w:left w:val="nil"/>
+          <w:bottom w:val="nil"/>
+          <w:right w:val="nil"/>
+          <w:between w:val="nil"/>
+        </w:pBdr>
+        <w:jc w:val="both"/>
+        <w:rPr>
+          <w:rFonts w:ascii="Times New Roman" w:eastAsia="Times New Roman" w:hAnsi="Times New Roman" w:cs="Times New Roman"/>
+          <w:sz w:val="24"/>
+          <w:szCs w:val="24"/>
+        </w:rPr>
+      </w:pPr>
+      <w:r>
+        <w:rPr>
+          <w:rFonts w:ascii="Times New Roman" w:eastAsia="Times New Roman" w:hAnsi="Times New Roman" w:cs="Times New Roman"/>
+          <w:sz w:val="24"/>
+          <w:szCs w:val="24"/>
+        </w:rPr>
+        <w:t xml:space="preserve">Maven es la herramienta de gestión de dependencias y construcción de proyectos utilizada en el backend. A través del archivo pom.xml, Maven centraliza la declaración de todas las dependencias del proyecto, gestiona sus versiones y las descarga automáticamente desde el repositorio Maven Central. Además, Maven se encarga de compilar el código, ejecutar los </w:t>
+      </w:r>
+      <w:proofErr w:type="spellStart"/>
+      <w:r>
+        <w:rPr>
+          <w:rFonts w:ascii="Times New Roman" w:eastAsia="Times New Roman" w:hAnsi="Times New Roman" w:cs="Times New Roman"/>
+          <w:sz w:val="24"/>
+          <w:szCs w:val="24"/>
+        </w:rPr>
+        <w:t>tests</w:t>
+      </w:r>
+      <w:proofErr w:type="spellEnd"/>
+      <w:r>
+        <w:rPr>
+          <w:rFonts w:ascii="Times New Roman" w:eastAsia="Times New Roman" w:hAnsi="Times New Roman" w:cs="Times New Roman"/>
+          <w:sz w:val="24"/>
+          <w:szCs w:val="24"/>
+        </w:rPr>
+        <w:t xml:space="preserve"> y empaquetar la aplicación en un archivo JAR ejecutable para su despliegue.</w:t>
+      </w:r>
+    </w:p>
+    <w:p>
+      <w:pPr>
+        <w:pBdr>
+          <w:top w:val="nil"/>
+          <w:left w:val="nil"/>
+          <w:bottom w:val="nil"/>
+          <w:right w:val="nil"/>
+          <w:between w:val="nil"/>
+        </w:pBdr>
+        <w:jc w:val="both"/>
+        <w:rPr>
+          <w:rFonts w:ascii="Times New Roman" w:eastAsia="Times New Roman" w:hAnsi="Times New Roman" w:cs="Times New Roman"/>
+          <w:sz w:val="24"/>
+          <w:szCs w:val="24"/>
+        </w:rPr>
+      </w:pPr>
+      <w:proofErr w:type="spellStart"/>
+      <w:r>
+        <w:rPr>
+          <w:rFonts w:ascii="Times New Roman" w:eastAsia="Times New Roman" w:hAnsi="Times New Roman" w:cs="Times New Roman"/>
+          <w:sz w:val="24"/>
+          <w:szCs w:val="24"/>
+        </w:rPr>
+        <w:t>npm</w:t>
+      </w:r>
+      <w:proofErr w:type="spellEnd"/>
+      <w:r>
+        <w:rPr>
+          <w:rFonts w:ascii="Times New Roman" w:eastAsia="Times New Roman" w:hAnsi="Times New Roman" w:cs="Times New Roman"/>
+          <w:sz w:val="24"/>
+          <w:szCs w:val="24"/>
+        </w:rPr>
+        <w:t xml:space="preserve"> (Node </w:t>
+      </w:r>
+      <w:proofErr w:type="spellStart"/>
+      <w:r>
+        <w:rPr>
+          <w:rFonts w:ascii="Times New Roman" w:eastAsia="Times New Roman" w:hAnsi="Times New Roman" w:cs="Times New Roman"/>
+          <w:sz w:val="24"/>
+          <w:szCs w:val="24"/>
+        </w:rPr>
+        <w:t>Package</w:t>
+      </w:r>
+      <w:proofErr w:type="spellEnd"/>
+      <w:r>
+        <w:rPr>
+          <w:rFonts w:ascii="Times New Roman" w:eastAsia="Times New Roman" w:hAnsi="Times New Roman" w:cs="Times New Roman"/>
+          <w:sz w:val="24"/>
+          <w:szCs w:val="24"/>
+        </w:rPr>
+        <w:t xml:space="preserve"> Manager) es el gestor de paquetes utilizado en el frontend. A través del archivo </w:t>
+      </w:r>
+      <w:proofErr w:type="spellStart"/>
+      <w:proofErr w:type="gramStart"/>
+      <w:r>
+        <w:rPr>
+          <w:rFonts w:ascii="Times New Roman" w:eastAsia="Times New Roman" w:hAnsi="Times New Roman" w:cs="Times New Roman"/>
+          <w:sz w:val="24"/>
+          <w:szCs w:val="24"/>
+        </w:rPr>
+        <w:t>package.json</w:t>
+      </w:r>
+      <w:proofErr w:type="spellEnd"/>
+      <w:proofErr w:type="gramEnd"/>
+      <w:r>
+        <w:rPr>
+          <w:rFonts w:ascii="Times New Roman" w:eastAsia="Times New Roman" w:hAnsi="Times New Roman" w:cs="Times New Roman"/>
+          <w:sz w:val="24"/>
+          <w:szCs w:val="24"/>
+        </w:rPr>
+        <w:t xml:space="preserve">, </w:t>
+      </w:r>
+      <w:proofErr w:type="spellStart"/>
+      <w:r>
+        <w:rPr>
+          <w:rFonts w:ascii="Times New Roman" w:eastAsia="Times New Roman" w:hAnsi="Times New Roman" w:cs="Times New Roman"/>
+          <w:sz w:val="24"/>
+          <w:szCs w:val="24"/>
+        </w:rPr>
+        <w:t>npm</w:t>
+      </w:r>
+      <w:proofErr w:type="spellEnd"/>
+      <w:r>
+        <w:rPr>
+          <w:rFonts w:ascii="Times New Roman" w:eastAsia="Times New Roman" w:hAnsi="Times New Roman" w:cs="Times New Roman"/>
+          <w:sz w:val="24"/>
+          <w:szCs w:val="24"/>
+        </w:rPr>
+        <w:t xml:space="preserve"> gestiona las dependencias de la aplicación React, incluyendo </w:t>
+      </w:r>
+      <w:proofErr w:type="spellStart"/>
+      <w:r>
+        <w:rPr>
+          <w:rFonts w:ascii="Times New Roman" w:eastAsia="Times New Roman" w:hAnsi="Times New Roman" w:cs="Times New Roman"/>
+          <w:sz w:val="24"/>
+          <w:szCs w:val="24"/>
+        </w:rPr>
+        <w:t>Tailwind</w:t>
+      </w:r>
+      <w:proofErr w:type="spellEnd"/>
+      <w:r>
+        <w:rPr>
+          <w:rFonts w:ascii="Times New Roman" w:eastAsia="Times New Roman" w:hAnsi="Times New Roman" w:cs="Times New Roman"/>
+          <w:sz w:val="24"/>
+          <w:szCs w:val="24"/>
+        </w:rPr>
+        <w:t xml:space="preserve"> CSS, Axios y las herramientas de desarrollo como Vite y </w:t>
+      </w:r>
+      <w:proofErr w:type="spellStart"/>
+      <w:r>
+        <w:rPr>
+          <w:rFonts w:ascii="Times New Roman" w:eastAsia="Times New Roman" w:hAnsi="Times New Roman" w:cs="Times New Roman"/>
+          <w:sz w:val="24"/>
+          <w:szCs w:val="24"/>
+        </w:rPr>
+        <w:t>ESLint</w:t>
+      </w:r>
+      <w:proofErr w:type="spellEnd"/>
+      <w:r>
+        <w:rPr>
+          <w:rFonts w:ascii="Times New Roman" w:eastAsia="Times New Roman" w:hAnsi="Times New Roman" w:cs="Times New Roman"/>
+          <w:sz w:val="24"/>
+          <w:szCs w:val="24"/>
+        </w:rPr>
+        <w:t xml:space="preserve">. Al igual que Maven en el backend, </w:t>
+      </w:r>
+      <w:proofErr w:type="spellStart"/>
+      <w:r>
+        <w:rPr>
+          <w:rFonts w:ascii="Times New Roman" w:eastAsia="Times New Roman" w:hAnsi="Times New Roman" w:cs="Times New Roman"/>
+          <w:sz w:val="24"/>
+          <w:szCs w:val="24"/>
+        </w:rPr>
+        <w:t>npm</w:t>
+      </w:r>
+      <w:proofErr w:type="spellEnd"/>
+      <w:r>
+        <w:rPr>
+          <w:rFonts w:ascii="Times New Roman" w:eastAsia="Times New Roman" w:hAnsi="Times New Roman" w:cs="Times New Roman"/>
+          <w:sz w:val="24"/>
+          <w:szCs w:val="24"/>
+        </w:rPr>
+        <w:t xml:space="preserve"> permite instalar, actualizar y eliminar dependencias de forma centralizada y reproducible.</w:t>
+      </w:r>
+    </w:p>
+    <w:p>
+      <w:pPr>
+        <w:pBdr>
+          <w:top w:val="nil"/>
+          <w:left w:val="nil"/>
+          <w:bottom w:val="nil"/>
+          <w:right w:val="nil"/>
+          <w:between w:val="nil"/>
+        </w:pBdr>
+        <w:jc w:val="both"/>
+        <w:rPr>
+          <w:rFonts w:ascii="Times New Roman" w:eastAsia="Times New Roman" w:hAnsi="Times New Roman" w:cs="Times New Roman"/>
+          <w:sz w:val="24"/>
+          <w:szCs w:val="24"/>
+        </w:rPr>
+      </w:pPr>
+    </w:p>
+    <w:p>
+      <w:pPr>
+        <w:pBdr>
+          <w:top w:val="nil"/>
+          <w:left w:val="nil"/>
+          <w:bottom w:val="nil"/>
+          <w:right w:val="nil"/>
+          <w:between w:val="nil"/>
+        </w:pBdr>
+        <w:jc w:val="both"/>
+        <w:rPr>
+          <w:rFonts w:ascii="Times New Roman" w:eastAsia="Times New Roman" w:hAnsi="Times New Roman" w:cs="Times New Roman"/>
+          <w:sz w:val="24"/>
+          <w:szCs w:val="24"/>
+        </w:rPr>
+      </w:pPr>
+    </w:p>
+    <w:p>
+      <w:pPr>
+        <w:pBdr>
+          <w:top w:val="nil"/>
+          <w:left w:val="nil"/>
+          <w:bottom w:val="nil"/>
+          <w:right w:val="nil"/>
+          <w:between w:val="nil"/>
+        </w:pBdr>
+        <w:jc w:val="both"/>
+        <w:rPr>
+          <w:b/>
+          <w:sz w:val="28"/>
+          <w:szCs w:val="28"/>
+        </w:rPr>
+      </w:pPr>
+      <w:r>
+        <w:rPr>
+          <w:b/>
+          <w:sz w:val="28"/>
+          <w:szCs w:val="28"/>
+        </w:rPr>
+        <w:t>3.4.</w:t>
+      </w:r>
+      <w:r>
+        <w:rPr>
+          <w:b/>
+          <w:sz w:val="28"/>
+          <w:szCs w:val="28"/>
+        </w:rPr>
+        <w:t>4</w:t>
+      </w:r>
+      <w:r>
+        <w:rPr>
+          <w:b/>
+          <w:sz w:val="28"/>
+          <w:szCs w:val="28"/>
+        </w:rPr>
+        <w:t xml:space="preserve">.- </w:t>
+      </w:r>
+      <w:r>
+        <w:rPr>
+          <w:b/>
+          <w:sz w:val="28"/>
+          <w:szCs w:val="28"/>
+        </w:rPr>
+        <w:t>Postman</w:t>
+      </w:r>
+    </w:p>
+    <w:p>
+      <w:pPr>
+        <w:pBdr>
+          <w:top w:val="nil"/>
+          <w:left w:val="nil"/>
+          <w:bottom w:val="nil"/>
+          <w:right w:val="nil"/>
+          <w:between w:val="nil"/>
+        </w:pBdr>
+        <w:jc w:val="both"/>
+        <w:rPr>
+          <w:rFonts w:ascii="Times New Roman" w:eastAsia="Times New Roman" w:hAnsi="Times New Roman" w:cs="Times New Roman"/>
+          <w:sz w:val="24"/>
+          <w:szCs w:val="24"/>
+        </w:rPr>
+      </w:pPr>
+    </w:p>
+    <w:p>
+      <w:pPr>
+        <w:pBdr>
+          <w:top w:val="nil"/>
+          <w:left w:val="nil"/>
+          <w:bottom w:val="nil"/>
+          <w:right w:val="nil"/>
+          <w:between w:val="nil"/>
+        </w:pBdr>
+        <w:jc w:val="both"/>
+        <w:rPr>
+          <w:rFonts w:ascii="Times New Roman" w:eastAsia="Times New Roman" w:hAnsi="Times New Roman" w:cs="Times New Roman"/>
+          <w:sz w:val="24"/>
+          <w:szCs w:val="24"/>
+        </w:rPr>
+      </w:pPr>
+      <w:r>
+        <w:rPr>
+          <w:rFonts w:ascii="Times New Roman" w:eastAsia="Times New Roman" w:hAnsi="Times New Roman" w:cs="Times New Roman"/>
+          <w:sz w:val="24"/>
+          <w:szCs w:val="24"/>
+        </w:rPr>
+        <w:t xml:space="preserve">Postman es una plataforma para el desarrollo, prueba y documentación de </w:t>
+      </w:r>
+      <w:proofErr w:type="spellStart"/>
+      <w:r>
+        <w:rPr>
+          <w:rFonts w:ascii="Times New Roman" w:eastAsia="Times New Roman" w:hAnsi="Times New Roman" w:cs="Times New Roman"/>
+          <w:sz w:val="24"/>
+          <w:szCs w:val="24"/>
+        </w:rPr>
+        <w:t>APIs</w:t>
+      </w:r>
+      <w:proofErr w:type="spellEnd"/>
+      <w:r>
+        <w:rPr>
+          <w:rFonts w:ascii="Times New Roman" w:eastAsia="Times New Roman" w:hAnsi="Times New Roman" w:cs="Times New Roman"/>
+          <w:sz w:val="24"/>
+          <w:szCs w:val="24"/>
+        </w:rPr>
+        <w:t xml:space="preserve">. Permite realizar peticiones HTTP a los </w:t>
+      </w:r>
+      <w:proofErr w:type="spellStart"/>
+      <w:r>
+        <w:rPr>
+          <w:rFonts w:ascii="Times New Roman" w:eastAsia="Times New Roman" w:hAnsi="Times New Roman" w:cs="Times New Roman"/>
+          <w:sz w:val="24"/>
+          <w:szCs w:val="24"/>
+        </w:rPr>
+        <w:t>endpoints</w:t>
+      </w:r>
+      <w:proofErr w:type="spellEnd"/>
+      <w:r>
+        <w:rPr>
+          <w:rFonts w:ascii="Times New Roman" w:eastAsia="Times New Roman" w:hAnsi="Times New Roman" w:cs="Times New Roman"/>
+          <w:sz w:val="24"/>
+          <w:szCs w:val="24"/>
+        </w:rPr>
+        <w:t xml:space="preserve"> del backend de forma manual, configurando los parámetros, las cabeceras y el cuerpo de cada petición, y visualizando la respuesta del servidor de forma estructurada. En </w:t>
+      </w:r>
+      <w:r>
+        <w:rPr>
+          <w:rFonts w:ascii="Times New Roman" w:eastAsia="Times New Roman" w:hAnsi="Times New Roman" w:cs="Times New Roman"/>
+          <w:sz w:val="24"/>
+          <w:szCs w:val="24"/>
+        </w:rPr>
+        <w:t>CarePet</w:t>
+      </w:r>
+      <w:r>
+        <w:rPr>
+          <w:rFonts w:ascii="Times New Roman" w:eastAsia="Times New Roman" w:hAnsi="Times New Roman" w:cs="Times New Roman"/>
+          <w:sz w:val="24"/>
+          <w:szCs w:val="24"/>
+        </w:rPr>
+        <w:t xml:space="preserve">, Postman se utiliza durante el desarrollo para verificar el comportamiento de cada </w:t>
+      </w:r>
+      <w:proofErr w:type="spellStart"/>
+      <w:r>
+        <w:rPr>
+          <w:rFonts w:ascii="Times New Roman" w:eastAsia="Times New Roman" w:hAnsi="Times New Roman" w:cs="Times New Roman"/>
+          <w:sz w:val="24"/>
+          <w:szCs w:val="24"/>
+        </w:rPr>
+        <w:t>endpoint</w:t>
+      </w:r>
+      <w:proofErr w:type="spellEnd"/>
+      <w:r>
+        <w:rPr>
+          <w:rFonts w:ascii="Times New Roman" w:eastAsia="Times New Roman" w:hAnsi="Times New Roman" w:cs="Times New Roman"/>
+          <w:sz w:val="24"/>
+          <w:szCs w:val="24"/>
+        </w:rPr>
+        <w:t xml:space="preserve"> de la API REST antes de integrarlo con el frontend, comprobando los códigos de respuesta, la estructura del JSON devuelto y el correcto funcionamiento de la autenticación mediante JWT.</w:t>
+      </w:r>
+    </w:p>
+    <w:p>
+      <w:pPr>
+        <w:pBdr>
+          <w:top w:val="nil"/>
+          <w:left w:val="nil"/>
+          <w:bottom w:val="nil"/>
+          <w:right w:val="nil"/>
+          <w:between w:val="nil"/>
+        </w:pBdr>
+        <w:jc w:val="both"/>
+        <w:rPr>
+          <w:rFonts w:ascii="Times New Roman" w:eastAsia="Times New Roman" w:hAnsi="Times New Roman" w:cs="Times New Roman"/>
+          <w:sz w:val="24"/>
+          <w:szCs w:val="24"/>
+        </w:rPr>
+      </w:pPr>
+    </w:p>
+    <w:p>
+      <w:pPr>
+        <w:pBdr>
+          <w:top w:val="nil"/>
+          <w:left w:val="nil"/>
+          <w:bottom w:val="nil"/>
+          <w:right w:val="nil"/>
+          <w:between w:val="nil"/>
+        </w:pBdr>
+        <w:jc w:val="both"/>
+        <w:rPr>
+          <w:rFonts w:ascii="Times New Roman" w:eastAsia="Times New Roman" w:hAnsi="Times New Roman" w:cs="Times New Roman"/>
+          <w:sz w:val="24"/>
+          <w:szCs w:val="24"/>
+        </w:rPr>
+      </w:pPr>
+    </w:p>
+    <w:p>
+      <w:pPr>
+        <w:pBdr>
+          <w:top w:val="nil"/>
+          <w:left w:val="nil"/>
+          <w:bottom w:val="nil"/>
+          <w:right w:val="nil"/>
+          <w:between w:val="nil"/>
+        </w:pBdr>
+        <w:rPr>
+          <w:b/>
+          <w:sz w:val="36"/>
+          <w:szCs w:val="36"/>
+        </w:rPr>
+      </w:pPr>
+      <w:r>
+        <w:rPr>
+          <w:b/>
+          <w:sz w:val="36"/>
+          <w:szCs w:val="36"/>
+        </w:rPr>
+        <w:t>3.</w:t>
+      </w:r>
+      <w:r>
+        <w:rPr>
+          <w:b/>
+          <w:sz w:val="36"/>
+          <w:szCs w:val="36"/>
+        </w:rPr>
+        <w:t>5</w:t>
+      </w:r>
+      <w:r>
+        <w:rPr>
+          <w:b/>
+          <w:sz w:val="36"/>
+          <w:szCs w:val="36"/>
+        </w:rPr>
+        <w:t xml:space="preserve">.- </w:t>
+      </w:r>
+      <w:r>
+        <w:rPr>
+          <w:b/>
+          <w:sz w:val="36"/>
+          <w:szCs w:val="36"/>
+        </w:rPr>
+        <w:t>Herramientas de desarrollo</w:t>
+      </w:r>
+    </w:p>
+    <w:p>
+      <w:pPr>
+        <w:pBdr>
+          <w:top w:val="nil"/>
+          <w:left w:val="nil"/>
+          <w:bottom w:val="nil"/>
+          <w:right w:val="nil"/>
+          <w:between w:val="nil"/>
+        </w:pBdr>
+        <w:jc w:val="both"/>
+        <w:rPr>
+          <w:rFonts w:ascii="Times New Roman" w:eastAsia="Times New Roman" w:hAnsi="Times New Roman" w:cs="Times New Roman"/>
+          <w:sz w:val="24"/>
+          <w:szCs w:val="24"/>
+        </w:rPr>
+      </w:pPr>
+    </w:p>
+    <w:p>
+      <w:pPr>
+        <w:pBdr>
+          <w:top w:val="nil"/>
+          <w:left w:val="nil"/>
+          <w:bottom w:val="nil"/>
+          <w:right w:val="nil"/>
+          <w:between w:val="nil"/>
+        </w:pBdr>
+        <w:jc w:val="both"/>
+        <w:rPr>
+          <w:rFonts w:ascii="Times New Roman" w:eastAsia="Times New Roman" w:hAnsi="Times New Roman" w:cs="Times New Roman"/>
+          <w:sz w:val="24"/>
+          <w:szCs w:val="24"/>
+        </w:rPr>
+      </w:pPr>
+      <w:r>
+        <w:rPr>
+          <w:rFonts w:ascii="Times New Roman" w:eastAsia="Times New Roman" w:hAnsi="Times New Roman" w:cs="Times New Roman"/>
+          <w:sz w:val="24"/>
+          <w:szCs w:val="24"/>
+        </w:rPr>
+        <w:lastRenderedPageBreak/>
+        <w:t xml:space="preserve">El despliegue de </w:t>
+      </w:r>
+      <w:r>
+        <w:rPr>
+          <w:rFonts w:ascii="Times New Roman" w:eastAsia="Times New Roman" w:hAnsi="Times New Roman" w:cs="Times New Roman"/>
+          <w:sz w:val="24"/>
+          <w:szCs w:val="24"/>
+        </w:rPr>
+        <w:t>CarePet</w:t>
+      </w:r>
+      <w:r>
+        <w:rPr>
+          <w:rFonts w:ascii="Times New Roman" w:eastAsia="Times New Roman" w:hAnsi="Times New Roman" w:cs="Times New Roman"/>
+          <w:sz w:val="24"/>
+          <w:szCs w:val="24"/>
+        </w:rPr>
+        <w:t xml:space="preserve"> está planificado sobre dos plataformas en la nube que ofrecen planes gratuitos suficientes para el ámbito de este proyecto: </w:t>
+      </w:r>
+      <w:proofErr w:type="spellStart"/>
+      <w:r>
+        <w:rPr>
+          <w:rFonts w:ascii="Times New Roman" w:eastAsia="Times New Roman" w:hAnsi="Times New Roman" w:cs="Times New Roman"/>
+          <w:sz w:val="24"/>
+          <w:szCs w:val="24"/>
+        </w:rPr>
+        <w:t>Vercel</w:t>
+      </w:r>
+      <w:proofErr w:type="spellEnd"/>
+      <w:r>
+        <w:rPr>
+          <w:rFonts w:ascii="Times New Roman" w:eastAsia="Times New Roman" w:hAnsi="Times New Roman" w:cs="Times New Roman"/>
+          <w:sz w:val="24"/>
+          <w:szCs w:val="24"/>
+        </w:rPr>
+        <w:t xml:space="preserve"> para el frontend y </w:t>
+      </w:r>
+      <w:proofErr w:type="spellStart"/>
+      <w:r>
+        <w:rPr>
+          <w:rFonts w:ascii="Times New Roman" w:eastAsia="Times New Roman" w:hAnsi="Times New Roman" w:cs="Times New Roman"/>
+          <w:sz w:val="24"/>
+          <w:szCs w:val="24"/>
+        </w:rPr>
+        <w:t>Railway</w:t>
+      </w:r>
+      <w:proofErr w:type="spellEnd"/>
+      <w:r>
+        <w:rPr>
+          <w:rFonts w:ascii="Times New Roman" w:eastAsia="Times New Roman" w:hAnsi="Times New Roman" w:cs="Times New Roman"/>
+          <w:sz w:val="24"/>
+          <w:szCs w:val="24"/>
+        </w:rPr>
+        <w:t xml:space="preserve"> para el backend y la base de datos.</w:t>
+      </w:r>
+    </w:p>
+    <w:p>
+      <w:pPr>
+        <w:pBdr>
+          <w:top w:val="nil"/>
+          <w:left w:val="nil"/>
+          <w:bottom w:val="nil"/>
+          <w:right w:val="nil"/>
+          <w:between w:val="nil"/>
+        </w:pBdr>
+        <w:jc w:val="both"/>
+        <w:rPr>
+          <w:rFonts w:ascii="Times New Roman" w:eastAsia="Times New Roman" w:hAnsi="Times New Roman" w:cs="Times New Roman"/>
+          <w:sz w:val="24"/>
+          <w:szCs w:val="24"/>
+        </w:rPr>
+      </w:pPr>
+    </w:p>
+    <w:p>
+      <w:pPr>
+        <w:pBdr>
+          <w:top w:val="nil"/>
+          <w:left w:val="nil"/>
+          <w:bottom w:val="nil"/>
+          <w:right w:val="nil"/>
+          <w:between w:val="nil"/>
+        </w:pBdr>
+        <w:jc w:val="both"/>
+        <w:rPr>
+          <w:rFonts w:ascii="Times New Roman" w:eastAsia="Times New Roman" w:hAnsi="Times New Roman" w:cs="Times New Roman"/>
+          <w:sz w:val="24"/>
+          <w:szCs w:val="24"/>
+        </w:rPr>
+      </w:pPr>
+    </w:p>
+    <w:p>
+      <w:pPr>
+        <w:pBdr>
+          <w:top w:val="nil"/>
+          <w:left w:val="nil"/>
+          <w:bottom w:val="nil"/>
+          <w:right w:val="nil"/>
+          <w:between w:val="nil"/>
+        </w:pBdr>
+        <w:jc w:val="both"/>
+        <w:rPr>
+          <w:b/>
+          <w:sz w:val="28"/>
+          <w:szCs w:val="28"/>
+        </w:rPr>
+      </w:pPr>
+      <w:r>
+        <w:rPr>
+          <w:b/>
+          <w:sz w:val="28"/>
+          <w:szCs w:val="28"/>
+        </w:rPr>
+        <w:t>3.</w:t>
+      </w:r>
+      <w:r>
+        <w:rPr>
+          <w:b/>
+          <w:sz w:val="28"/>
+          <w:szCs w:val="28"/>
+        </w:rPr>
+        <w:t>5</w:t>
+      </w:r>
+      <w:r>
+        <w:rPr>
+          <w:b/>
+          <w:sz w:val="28"/>
+          <w:szCs w:val="28"/>
+        </w:rPr>
+        <w:t>.</w:t>
+      </w:r>
+      <w:r>
+        <w:rPr>
+          <w:b/>
+          <w:sz w:val="28"/>
+          <w:szCs w:val="28"/>
+        </w:rPr>
+        <w:t>1</w:t>
+      </w:r>
+      <w:r>
+        <w:rPr>
+          <w:b/>
+          <w:sz w:val="28"/>
+          <w:szCs w:val="28"/>
+        </w:rPr>
+        <w:t xml:space="preserve">.- </w:t>
+      </w:r>
+      <w:proofErr w:type="spellStart"/>
+      <w:r>
+        <w:rPr>
+          <w:b/>
+          <w:sz w:val="28"/>
+          <w:szCs w:val="28"/>
+        </w:rPr>
+        <w:t>Vercel</w:t>
+      </w:r>
+      <w:proofErr w:type="spellEnd"/>
+    </w:p>
+    <w:p>
+      <w:pPr>
+        <w:pBdr>
+          <w:top w:val="nil"/>
+          <w:left w:val="nil"/>
+          <w:bottom w:val="nil"/>
+          <w:right w:val="nil"/>
+          <w:between w:val="nil"/>
+        </w:pBdr>
+        <w:jc w:val="both"/>
+        <w:rPr>
+          <w:rFonts w:ascii="Times New Roman" w:eastAsia="Times New Roman" w:hAnsi="Times New Roman" w:cs="Times New Roman"/>
+          <w:sz w:val="24"/>
+          <w:szCs w:val="24"/>
+        </w:rPr>
+      </w:pPr>
+    </w:p>
+    <w:p>
+      <w:pPr>
+        <w:pBdr>
+          <w:top w:val="nil"/>
+          <w:left w:val="nil"/>
+          <w:bottom w:val="nil"/>
+          <w:right w:val="nil"/>
+          <w:between w:val="nil"/>
+        </w:pBdr>
+        <w:jc w:val="both"/>
+        <w:rPr>
+          <w:rFonts w:ascii="Times New Roman" w:eastAsia="Times New Roman" w:hAnsi="Times New Roman" w:cs="Times New Roman"/>
+          <w:sz w:val="24"/>
+          <w:szCs w:val="24"/>
+        </w:rPr>
+      </w:pPr>
+      <w:proofErr w:type="spellStart"/>
+      <w:r>
+        <w:rPr>
+          <w:rFonts w:ascii="Times New Roman" w:eastAsia="Times New Roman" w:hAnsi="Times New Roman" w:cs="Times New Roman"/>
+          <w:sz w:val="24"/>
+          <w:szCs w:val="24"/>
+        </w:rPr>
+        <w:t>Vercel</w:t>
+      </w:r>
+      <w:proofErr w:type="spellEnd"/>
+      <w:r>
+        <w:rPr>
+          <w:rFonts w:ascii="Times New Roman" w:eastAsia="Times New Roman" w:hAnsi="Times New Roman" w:cs="Times New Roman"/>
+          <w:sz w:val="24"/>
+          <w:szCs w:val="24"/>
+        </w:rPr>
+        <w:t xml:space="preserve"> es una plataforma de despliegue especializada en aplicaciones frontend y sitios web estáticos. Ofrece integración nativa con GitHub: cuando se realiza un push a la rama configurada del repositorio, </w:t>
+      </w:r>
+      <w:proofErr w:type="spellStart"/>
+      <w:r>
+        <w:rPr>
+          <w:rFonts w:ascii="Times New Roman" w:eastAsia="Times New Roman" w:hAnsi="Times New Roman" w:cs="Times New Roman"/>
+          <w:sz w:val="24"/>
+          <w:szCs w:val="24"/>
+        </w:rPr>
+        <w:t>Vercel</w:t>
+      </w:r>
+      <w:proofErr w:type="spellEnd"/>
+      <w:r>
+        <w:rPr>
+          <w:rFonts w:ascii="Times New Roman" w:eastAsia="Times New Roman" w:hAnsi="Times New Roman" w:cs="Times New Roman"/>
+          <w:sz w:val="24"/>
+          <w:szCs w:val="24"/>
+        </w:rPr>
+        <w:t xml:space="preserve"> detecta el cambio automáticamente, construye la aplicación ejecutando el comando de </w:t>
+      </w:r>
+      <w:proofErr w:type="spellStart"/>
+      <w:r>
+        <w:rPr>
+          <w:rFonts w:ascii="Times New Roman" w:eastAsia="Times New Roman" w:hAnsi="Times New Roman" w:cs="Times New Roman"/>
+          <w:sz w:val="24"/>
+          <w:szCs w:val="24"/>
+        </w:rPr>
+        <w:t>build</w:t>
+      </w:r>
+      <w:proofErr w:type="spellEnd"/>
+      <w:r>
+        <w:rPr>
+          <w:rFonts w:ascii="Times New Roman" w:eastAsia="Times New Roman" w:hAnsi="Times New Roman" w:cs="Times New Roman"/>
+          <w:sz w:val="24"/>
+          <w:szCs w:val="24"/>
+        </w:rPr>
+        <w:t xml:space="preserve"> de Vite y despliega el resultado en su red de distribución de contenidos (CDN) global. Esto garantiza tiempos de carga bajos independientemente de la ubicación geográfica del usuario.</w:t>
+      </w:r>
+    </w:p>
+    <w:p>
+      <w:pPr>
+        <w:pBdr>
+          <w:top w:val="nil"/>
+          <w:left w:val="nil"/>
+          <w:bottom w:val="nil"/>
+          <w:right w:val="nil"/>
+          <w:between w:val="nil"/>
+        </w:pBdr>
+        <w:jc w:val="both"/>
+        <w:rPr>
+          <w:rFonts w:ascii="Times New Roman" w:eastAsia="Times New Roman" w:hAnsi="Times New Roman" w:cs="Times New Roman"/>
+          <w:sz w:val="24"/>
+          <w:szCs w:val="24"/>
+        </w:rPr>
+      </w:pPr>
+    </w:p>
+    <w:p>
+      <w:pPr>
+        <w:pBdr>
+          <w:top w:val="nil"/>
+          <w:left w:val="nil"/>
+          <w:bottom w:val="nil"/>
+          <w:right w:val="nil"/>
+          <w:between w:val="nil"/>
+        </w:pBdr>
+        <w:jc w:val="both"/>
+        <w:rPr>
+          <w:rFonts w:ascii="Times New Roman" w:eastAsia="Times New Roman" w:hAnsi="Times New Roman" w:cs="Times New Roman"/>
+          <w:sz w:val="24"/>
+          <w:szCs w:val="24"/>
+        </w:rPr>
+      </w:pPr>
+      <w:r>
+        <w:rPr>
+          <w:rFonts w:ascii="Times New Roman" w:eastAsia="Times New Roman" w:hAnsi="Times New Roman" w:cs="Times New Roman"/>
+          <w:sz w:val="24"/>
+          <w:szCs w:val="24"/>
+        </w:rPr>
+        <w:t xml:space="preserve">Entre sus características más relevantes para este proyecto destacan la provisión automática de certificados HTTPS, la generación de </w:t>
+      </w:r>
+      <w:proofErr w:type="spellStart"/>
+      <w:r>
+        <w:rPr>
+          <w:rFonts w:ascii="Times New Roman" w:eastAsia="Times New Roman" w:hAnsi="Times New Roman" w:cs="Times New Roman"/>
+          <w:sz w:val="24"/>
+          <w:szCs w:val="24"/>
+        </w:rPr>
+        <w:t>URLs</w:t>
+      </w:r>
+      <w:proofErr w:type="spellEnd"/>
+      <w:r>
+        <w:rPr>
+          <w:rFonts w:ascii="Times New Roman" w:eastAsia="Times New Roman" w:hAnsi="Times New Roman" w:cs="Times New Roman"/>
+          <w:sz w:val="24"/>
+          <w:szCs w:val="24"/>
+        </w:rPr>
+        <w:t xml:space="preserve"> de previsualización para cada rama del repositorio y su plan gratuito sin limitaciones de ancho de banda para proyectos personales. Las alternativas consideradas fueron </w:t>
+      </w:r>
+      <w:proofErr w:type="spellStart"/>
+      <w:r>
+        <w:rPr>
+          <w:rFonts w:ascii="Times New Roman" w:eastAsia="Times New Roman" w:hAnsi="Times New Roman" w:cs="Times New Roman"/>
+          <w:sz w:val="24"/>
+          <w:szCs w:val="24"/>
+        </w:rPr>
+        <w:t>Netlify</w:t>
+      </w:r>
+      <w:proofErr w:type="spellEnd"/>
+      <w:r>
+        <w:rPr>
+          <w:rFonts w:ascii="Times New Roman" w:eastAsia="Times New Roman" w:hAnsi="Times New Roman" w:cs="Times New Roman"/>
+          <w:sz w:val="24"/>
+          <w:szCs w:val="24"/>
+        </w:rPr>
+        <w:t xml:space="preserve"> y GitHub Pages, igualmente válidas, pero </w:t>
+      </w:r>
+      <w:proofErr w:type="spellStart"/>
+      <w:r>
+        <w:rPr>
+          <w:rFonts w:ascii="Times New Roman" w:eastAsia="Times New Roman" w:hAnsi="Times New Roman" w:cs="Times New Roman"/>
+          <w:sz w:val="24"/>
+          <w:szCs w:val="24"/>
+        </w:rPr>
+        <w:t>Vercel</w:t>
+      </w:r>
+      <w:proofErr w:type="spellEnd"/>
+      <w:r>
+        <w:rPr>
+          <w:rFonts w:ascii="Times New Roman" w:eastAsia="Times New Roman" w:hAnsi="Times New Roman" w:cs="Times New Roman"/>
+          <w:sz w:val="24"/>
+          <w:szCs w:val="24"/>
+        </w:rPr>
+        <w:t xml:space="preserve"> fue preferido por su mayor integración con el ecosistema React y Vite.</w:t>
+      </w:r>
+    </w:p>
+    <w:p>
+      <w:pPr>
+        <w:pBdr>
+          <w:top w:val="nil"/>
+          <w:left w:val="nil"/>
+          <w:bottom w:val="nil"/>
+          <w:right w:val="nil"/>
+          <w:between w:val="nil"/>
+        </w:pBdr>
+        <w:jc w:val="both"/>
+        <w:rPr>
+          <w:rFonts w:ascii="Times New Roman" w:eastAsia="Times New Roman" w:hAnsi="Times New Roman" w:cs="Times New Roman"/>
+          <w:sz w:val="24"/>
+          <w:szCs w:val="24"/>
+        </w:rPr>
+      </w:pPr>
+    </w:p>
+    <w:p>
+      <w:pPr>
+        <w:pBdr>
+          <w:top w:val="nil"/>
+          <w:left w:val="nil"/>
+          <w:bottom w:val="nil"/>
+          <w:right w:val="nil"/>
+          <w:between w:val="nil"/>
+        </w:pBdr>
+        <w:jc w:val="both"/>
+        <w:rPr>
+          <w:rFonts w:ascii="Times New Roman" w:eastAsia="Times New Roman" w:hAnsi="Times New Roman" w:cs="Times New Roman"/>
+          <w:sz w:val="24"/>
+          <w:szCs w:val="24"/>
+        </w:rPr>
+      </w:pPr>
+    </w:p>
+    <w:p>
+      <w:pPr>
+        <w:pBdr>
+          <w:top w:val="nil"/>
+          <w:left w:val="nil"/>
+          <w:bottom w:val="nil"/>
+          <w:right w:val="nil"/>
+          <w:between w:val="nil"/>
+        </w:pBdr>
+        <w:jc w:val="both"/>
+        <w:rPr>
+          <w:b/>
+          <w:sz w:val="28"/>
+          <w:szCs w:val="28"/>
+        </w:rPr>
+      </w:pPr>
+      <w:r>
+        <w:rPr>
+          <w:b/>
+          <w:sz w:val="28"/>
+          <w:szCs w:val="28"/>
+        </w:rPr>
+        <w:t>3.5.</w:t>
+      </w:r>
+      <w:r>
+        <w:rPr>
+          <w:b/>
+          <w:sz w:val="28"/>
+          <w:szCs w:val="28"/>
+        </w:rPr>
+        <w:t>2</w:t>
+      </w:r>
+      <w:r>
+        <w:rPr>
+          <w:b/>
+          <w:sz w:val="28"/>
+          <w:szCs w:val="28"/>
+        </w:rPr>
+        <w:t xml:space="preserve">.- </w:t>
+      </w:r>
+      <w:proofErr w:type="spellStart"/>
+      <w:r>
+        <w:rPr>
+          <w:b/>
+          <w:sz w:val="28"/>
+          <w:szCs w:val="28"/>
+        </w:rPr>
+        <w:t>Railway</w:t>
+      </w:r>
+      <w:proofErr w:type="spellEnd"/>
+    </w:p>
+    <w:p>
+      <w:pPr>
+        <w:pBdr>
+          <w:top w:val="nil"/>
+          <w:left w:val="nil"/>
+          <w:bottom w:val="nil"/>
+          <w:right w:val="nil"/>
+          <w:between w:val="nil"/>
+        </w:pBdr>
+        <w:jc w:val="both"/>
+        <w:rPr>
+          <w:rFonts w:ascii="Times New Roman" w:eastAsia="Times New Roman" w:hAnsi="Times New Roman" w:cs="Times New Roman"/>
+          <w:sz w:val="24"/>
+          <w:szCs w:val="24"/>
+        </w:rPr>
+      </w:pPr>
+    </w:p>
+    <w:p>
+      <w:pPr>
+        <w:pBdr>
+          <w:top w:val="nil"/>
+          <w:left w:val="nil"/>
+          <w:bottom w:val="nil"/>
+          <w:right w:val="nil"/>
+          <w:between w:val="nil"/>
+        </w:pBdr>
+        <w:jc w:val="both"/>
+        <w:rPr>
+          <w:rFonts w:ascii="Times New Roman" w:eastAsia="Times New Roman" w:hAnsi="Times New Roman" w:cs="Times New Roman"/>
+          <w:sz w:val="24"/>
+          <w:szCs w:val="24"/>
+        </w:rPr>
+      </w:pPr>
+      <w:proofErr w:type="spellStart"/>
+      <w:r>
+        <w:rPr>
+          <w:rFonts w:ascii="Times New Roman" w:eastAsia="Times New Roman" w:hAnsi="Times New Roman" w:cs="Times New Roman"/>
+          <w:sz w:val="24"/>
+          <w:szCs w:val="24"/>
+        </w:rPr>
+        <w:t>Railway</w:t>
+      </w:r>
+      <w:proofErr w:type="spellEnd"/>
+      <w:r>
+        <w:rPr>
+          <w:rFonts w:ascii="Times New Roman" w:eastAsia="Times New Roman" w:hAnsi="Times New Roman" w:cs="Times New Roman"/>
+          <w:sz w:val="24"/>
+          <w:szCs w:val="24"/>
+        </w:rPr>
+        <w:t xml:space="preserve"> es una plataforma de despliegue en la nube orientada a aplicaciones backend y bases de datos. Permite desplegar aplicaciones Spring Boot empaquetadas como archivos JAR y aprovisionar instancias de MySQL gestionadas, ambas en el mismo entorno y con comunicación interna directa. </w:t>
+      </w:r>
+      <w:proofErr w:type="spellStart"/>
+      <w:r>
+        <w:rPr>
+          <w:rFonts w:ascii="Times New Roman" w:eastAsia="Times New Roman" w:hAnsi="Times New Roman" w:cs="Times New Roman"/>
+          <w:sz w:val="24"/>
+          <w:szCs w:val="24"/>
+        </w:rPr>
+        <w:t>Railway</w:t>
+      </w:r>
+      <w:proofErr w:type="spellEnd"/>
+      <w:r>
+        <w:rPr>
+          <w:rFonts w:ascii="Times New Roman" w:eastAsia="Times New Roman" w:hAnsi="Times New Roman" w:cs="Times New Roman"/>
+          <w:sz w:val="24"/>
+          <w:szCs w:val="24"/>
+        </w:rPr>
+        <w:t xml:space="preserve"> ofrece un plan gratuito con cinco dólares de crédito mensual, suficiente para mantener activas las instancias del backend y la base de datos durante el desarrollo y la evaluación del proyecto.</w:t>
+      </w:r>
+    </w:p>
+    <w:p>
+      <w:pPr>
+        <w:pBdr>
+          <w:top w:val="nil"/>
+          <w:left w:val="nil"/>
+          <w:bottom w:val="nil"/>
+          <w:right w:val="nil"/>
+          <w:between w:val="nil"/>
+        </w:pBdr>
+        <w:jc w:val="both"/>
+        <w:rPr>
+          <w:rFonts w:ascii="Times New Roman" w:eastAsia="Times New Roman" w:hAnsi="Times New Roman" w:cs="Times New Roman"/>
+          <w:sz w:val="24"/>
+          <w:szCs w:val="24"/>
+        </w:rPr>
+      </w:pPr>
+    </w:p>
+    <w:p>
+      <w:pPr>
+        <w:pBdr>
+          <w:top w:val="nil"/>
+          <w:left w:val="nil"/>
+          <w:bottom w:val="nil"/>
+          <w:right w:val="nil"/>
+          <w:between w:val="nil"/>
+        </w:pBdr>
+        <w:jc w:val="both"/>
+        <w:rPr>
+          <w:rFonts w:ascii="Times New Roman" w:eastAsia="Times New Roman" w:hAnsi="Times New Roman" w:cs="Times New Roman"/>
+          <w:sz w:val="24"/>
+          <w:szCs w:val="24"/>
+        </w:rPr>
+      </w:pPr>
+      <w:r>
+        <w:rPr>
+          <w:rFonts w:ascii="Times New Roman" w:eastAsia="Times New Roman" w:hAnsi="Times New Roman" w:cs="Times New Roman"/>
+          <w:sz w:val="24"/>
+          <w:szCs w:val="24"/>
+        </w:rPr>
+        <w:t xml:space="preserve">Al igual que </w:t>
+      </w:r>
+      <w:proofErr w:type="spellStart"/>
+      <w:r>
+        <w:rPr>
+          <w:rFonts w:ascii="Times New Roman" w:eastAsia="Times New Roman" w:hAnsi="Times New Roman" w:cs="Times New Roman"/>
+          <w:sz w:val="24"/>
+          <w:szCs w:val="24"/>
+        </w:rPr>
+        <w:t>Vercel</w:t>
+      </w:r>
+      <w:proofErr w:type="spellEnd"/>
+      <w:r>
+        <w:rPr>
+          <w:rFonts w:ascii="Times New Roman" w:eastAsia="Times New Roman" w:hAnsi="Times New Roman" w:cs="Times New Roman"/>
+          <w:sz w:val="24"/>
+          <w:szCs w:val="24"/>
+        </w:rPr>
+        <w:t xml:space="preserve">, </w:t>
+      </w:r>
+      <w:proofErr w:type="spellStart"/>
+      <w:r>
+        <w:rPr>
+          <w:rFonts w:ascii="Times New Roman" w:eastAsia="Times New Roman" w:hAnsi="Times New Roman" w:cs="Times New Roman"/>
+          <w:sz w:val="24"/>
+          <w:szCs w:val="24"/>
+        </w:rPr>
+        <w:t>Railway</w:t>
+      </w:r>
+      <w:proofErr w:type="spellEnd"/>
+      <w:r>
+        <w:rPr>
+          <w:rFonts w:ascii="Times New Roman" w:eastAsia="Times New Roman" w:hAnsi="Times New Roman" w:cs="Times New Roman"/>
+          <w:sz w:val="24"/>
+          <w:szCs w:val="24"/>
+        </w:rPr>
+        <w:t xml:space="preserve"> está integrado con GitHub y permite configurar despliegues automáticos ante cambios en la rama de producción. La gestión de variables de entorno, como las credenciales de la base de datos o la clave de firma de los tokens JWT, se realiza de forma segura a través del panel de </w:t>
+      </w:r>
+      <w:proofErr w:type="spellStart"/>
+      <w:r>
+        <w:rPr>
+          <w:rFonts w:ascii="Times New Roman" w:eastAsia="Times New Roman" w:hAnsi="Times New Roman" w:cs="Times New Roman"/>
+          <w:sz w:val="24"/>
+          <w:szCs w:val="24"/>
+        </w:rPr>
+        <w:t>Railway</w:t>
+      </w:r>
+      <w:proofErr w:type="spellEnd"/>
+      <w:r>
+        <w:rPr>
+          <w:rFonts w:ascii="Times New Roman" w:eastAsia="Times New Roman" w:hAnsi="Times New Roman" w:cs="Times New Roman"/>
+          <w:sz w:val="24"/>
+          <w:szCs w:val="24"/>
+        </w:rPr>
+        <w:t xml:space="preserve"> sin necesidad de incluirlas en el repositorio de código. Las alternativas consideradas fueron Render, </w:t>
+      </w:r>
+      <w:proofErr w:type="spellStart"/>
+      <w:r>
+        <w:rPr>
+          <w:rFonts w:ascii="Times New Roman" w:eastAsia="Times New Roman" w:hAnsi="Times New Roman" w:cs="Times New Roman"/>
+          <w:sz w:val="24"/>
+          <w:szCs w:val="24"/>
+        </w:rPr>
+        <w:t>Heroku</w:t>
+      </w:r>
+      <w:proofErr w:type="spellEnd"/>
+      <w:r>
+        <w:rPr>
+          <w:rFonts w:ascii="Times New Roman" w:eastAsia="Times New Roman" w:hAnsi="Times New Roman" w:cs="Times New Roman"/>
+          <w:sz w:val="24"/>
+          <w:szCs w:val="24"/>
+        </w:rPr>
+        <w:t xml:space="preserve"> y AWS. Render fue descartado por su tiempo de arranque en frío en el plan gratuito. </w:t>
+      </w:r>
+      <w:proofErr w:type="spellStart"/>
+      <w:r>
+        <w:rPr>
+          <w:rFonts w:ascii="Times New Roman" w:eastAsia="Times New Roman" w:hAnsi="Times New Roman" w:cs="Times New Roman"/>
+          <w:sz w:val="24"/>
+          <w:szCs w:val="24"/>
+        </w:rPr>
+        <w:t>Heroku</w:t>
+      </w:r>
+      <w:proofErr w:type="spellEnd"/>
+      <w:r>
+        <w:rPr>
+          <w:rFonts w:ascii="Times New Roman" w:eastAsia="Times New Roman" w:hAnsi="Times New Roman" w:cs="Times New Roman"/>
+          <w:sz w:val="24"/>
+          <w:szCs w:val="24"/>
+        </w:rPr>
+        <w:t xml:space="preserve"> fue descartado por haber eliminado su plan gratuito. AWS fue descartado por su complejidad de configuración, que excede las necesidades de este proyecto.</w:t>
       </w:r>
     </w:p>
     <w:p>

</xml_diff>